<commit_message>
Add frequency tables, histograms and station stats
Update script to compute and export analysis outputs: generate frequency tables and histograms of Northern Hemisphere temperature anomalies for 1951–1980 and 1981–2010 (saved as tabla_1951_1980.xlsx, tabla_1981_2010.xlsx and Histograma_Comparacion_Anomalias.png). Calculate D3/D7 deciles for 1951–1980 and save Tabla_Deciles_1951_1980.xlsx; classify and summarize "hot" anomalies for 1981–2010 (Tabla_Resultado_Hot_Anomalies.xlsx). Compute seasonal (DJF/MAM/JJA/SON) means and variances for 1921–1950, 1951–1980 and 1981–2010 and save Tabla_Estaciones.xlsx. Several output binary files (Excel and PNG) were added and the Word document was updated.
</commit_message>
<xml_diff>
--- a/Documents/Taller 3 Doing Economics 1 Climate Change_3A.docx
+++ b/Documents/Taller 3 Doing Economics 1 Climate Change_3A.docx
@@ -1068,11 +1068,13 @@
     <w:p>
       <w:pPr>
         <w:rPr>
-          <w:lang w:val="es-419"/>
-        </w:rPr>
-      </w:pPr>
-      <w:r>
-        <w:rPr>
+          <w:highlight w:val="yellow"/>
+          <w:lang w:val="es-419"/>
+        </w:rPr>
+      </w:pPr>
+      <w:r>
+        <w:rPr>
+          <w:highlight w:val="yellow"/>
           <w:lang w:val="es-419"/>
         </w:rPr>
         <w:t>Entre las similitudes que comparten estos gráficos se encuentran: la medición de la anomalía de temperatura en grados Celsius; la presencia de una tendencia creciente a lo largo del tiempo en el intervalo correspondiente; y el uso de un período de referencia específico para calcular la desviación.</w:t>
@@ -1086,6 +1088,7 @@
       </w:pPr>
       <w:r>
         <w:rPr>
+          <w:highlight w:val="yellow"/>
           <w:lang w:val="es-419"/>
         </w:rPr>
         <w:t>No obstante, también presentan diferencias importantes. En esencia, el cambio del período promedio de referencia (1951–1980) a (1961–1990) genera variaciones en la medición de la anomalía, ya que implica tomar como base una temperatura promedio distinta, posiblemente más alta. Por otro lado, en algunos casos no se marca explícitamente la línea central de promedio (0 °C), lo que podría facilitar la interpretación visual. Además, el rango de años que se muestra no siempre es el mismo, lo que dificulta realizar comparaciones directas entre los gráficos.</w:t>
@@ -1125,6 +1128,7 @@
       </w:pPr>
       <w:r>
         <w:rPr>
+          <w:highlight w:val="yellow"/>
           <w:lang w:val="es-419"/>
         </w:rPr>
         <w:t>La referencia que provee esta imagen, que va desde 1000 hasta 1900, no implica que la gráfica con un intervalo distinto sea inusual. De hecho, en ambas gráficas se observa una tendencia similar: un período inicial relativamente estable o con variaciones moderadas en las anomalías, seguido de un crecimiento acelerado en los valores. Este aumento podría estar asociado al crecimiento industrial descontrolado y a otros factores relacionados con el cambio climático.</w:t>
@@ -1153,6 +1157,7 @@
       </w:pPr>
       <w:r>
         <w:rPr>
+          <w:highlight w:val="yellow"/>
           <w:lang w:val="es-419"/>
         </w:rPr>
         <w:t>Según la evidencia presentada en las gráficas, tanto los gobiernos como otros actores pueden observar que, con el paso del tiempo, las anomalías han aumentado de manera sostenida. Esto se traduce en un incremento de la temperatura con respecto a los promedios regulares o de largo plazo. No obstante, los gobiernos deben preocuparse por cómo contener estas anomalías y mitigar esta tendencia creciente, ya que su comportamiento acelerado representa riesgos importantes para el futuro de la humanidad.</w:t>
@@ -1376,17 +1381,585 @@
     </w:p>
     <w:p>
       <w:pPr>
-        <w:pStyle w:val="Heading3"/>
-        <w:rPr>
-          <w:lang w:val="es-419"/>
-        </w:rPr>
-      </w:pPr>
-      <w:r>
-        <w:rPr>
-          <w:lang w:val="es-419"/>
-        </w:rPr>
-        <w:t>Pregunta 1.2.2</w:t>
-      </w:r>
+        <w:rPr>
+          <w:lang w:val="es-419"/>
+        </w:rPr>
+      </w:pPr>
+      <w:r>
+        <w:rPr>
+          <w:lang w:val="es-419"/>
+        </w:rPr>
+        <w:t>Tabla 1. Frecuencias por anomalías 1951-1980</w:t>
+      </w:r>
+    </w:p>
+    <w:tbl>
+      <w:tblPr>
+        <w:tblStyle w:val="TableGrid"/>
+        <w:tblW w:w="2830" w:type="dxa"/>
+        <w:tblLook w:val="04A0" w:firstRow="1" w:lastRow="0" w:firstColumn="1" w:lastColumn="0" w:noHBand="0" w:noVBand="1"/>
+      </w:tblPr>
+      <w:tblGrid>
+        <w:gridCol w:w="1555"/>
+        <w:gridCol w:w="1275"/>
+      </w:tblGrid>
+      <w:tr>
+        <w:trPr>
+          <w:trHeight w:val="288"/>
+        </w:trPr>
+        <w:tc>
+          <w:tcPr>
+            <w:tcW w:w="1555" w:type="dxa"/>
+            <w:noWrap/>
+            <w:hideMark/>
+          </w:tcPr>
+          <w:p>
+            <w:pPr>
+              <w:jc w:val="center"/>
+              <w:rPr>
+                <w:rFonts w:ascii="Calibri" w:eastAsia="Times New Roman" w:hAnsi="Calibri" w:cs="Calibri"/>
+                <w:b/>
+                <w:bCs/>
+                <w:color w:val="000000"/>
+                <w:lang w:val="en-GB" w:eastAsia="es-CO"/>
+              </w:rPr>
+            </w:pPr>
+            <w:r>
+              <w:rPr>
+                <w:rFonts w:ascii="Calibri" w:eastAsia="Times New Roman" w:hAnsi="Calibri" w:cs="Calibri"/>
+                <w:b/>
+                <w:bCs/>
+                <w:color w:val="000000"/>
+                <w:lang w:val="en-GB" w:eastAsia="es-CO"/>
+              </w:rPr>
+              <w:t>Range of temperature anomaly (T)</w:t>
+            </w:r>
+          </w:p>
+        </w:tc>
+        <w:tc>
+          <w:tcPr>
+            <w:tcW w:w="1275" w:type="dxa"/>
+            <w:noWrap/>
+            <w:hideMark/>
+          </w:tcPr>
+          <w:p>
+            <w:pPr>
+              <w:jc w:val="center"/>
+              <w:rPr>
+                <w:rFonts w:ascii="Calibri" w:eastAsia="Times New Roman" w:hAnsi="Calibri" w:cs="Calibri"/>
+                <w:b/>
+                <w:bCs/>
+                <w:color w:val="000000"/>
+                <w:lang w:val="es-CO" w:eastAsia="es-CO"/>
+              </w:rPr>
+            </w:pPr>
+            <w:proofErr w:type="spellStart"/>
+            <w:r>
+              <w:rPr>
+                <w:rFonts w:ascii="Calibri" w:eastAsia="Times New Roman" w:hAnsi="Calibri" w:cs="Calibri"/>
+                <w:b/>
+                <w:bCs/>
+                <w:color w:val="000000"/>
+                <w:lang w:val="es-CO" w:eastAsia="es-CO"/>
+              </w:rPr>
+              <w:t>Frequency</w:t>
+            </w:r>
+            <w:proofErr w:type="spellEnd"/>
+          </w:p>
+        </w:tc>
+      </w:tr>
+      <w:tr>
+        <w:trPr>
+          <w:trHeight w:val="288"/>
+        </w:trPr>
+        <w:tc>
+          <w:tcPr>
+            <w:tcW w:w="1555" w:type="dxa"/>
+            <w:noWrap/>
+            <w:hideMark/>
+          </w:tcPr>
+          <w:p>
+            <w:pPr>
+              <w:rPr>
+                <w:rFonts w:ascii="Calibri" w:eastAsia="Times New Roman" w:hAnsi="Calibri" w:cs="Calibri"/>
+                <w:color w:val="000000"/>
+                <w:lang w:val="es-CO" w:eastAsia="es-CO"/>
+              </w:rPr>
+            </w:pPr>
+            <w:r>
+              <w:rPr>
+                <w:rFonts w:ascii="Calibri" w:eastAsia="Times New Roman" w:hAnsi="Calibri" w:cs="Calibri"/>
+                <w:color w:val="000000"/>
+                <w:lang w:val="es-CO" w:eastAsia="es-CO"/>
+              </w:rPr>
+              <w:t>(-0.24, -0.19]</w:t>
+            </w:r>
+          </w:p>
+        </w:tc>
+        <w:tc>
+          <w:tcPr>
+            <w:tcW w:w="1275" w:type="dxa"/>
+            <w:noWrap/>
+            <w:hideMark/>
+          </w:tcPr>
+          <w:p>
+            <w:pPr>
+              <w:jc w:val="right"/>
+              <w:rPr>
+                <w:rFonts w:ascii="Calibri" w:eastAsia="Times New Roman" w:hAnsi="Calibri" w:cs="Calibri"/>
+                <w:color w:val="000000"/>
+                <w:lang w:val="es-CO" w:eastAsia="es-CO"/>
+              </w:rPr>
+            </w:pPr>
+            <w:r>
+              <w:rPr>
+                <w:rFonts w:ascii="Calibri" w:eastAsia="Times New Roman" w:hAnsi="Calibri" w:cs="Calibri"/>
+                <w:color w:val="000000"/>
+                <w:lang w:val="es-CO" w:eastAsia="es-CO"/>
+              </w:rPr>
+              <w:t>3</w:t>
+            </w:r>
+          </w:p>
+        </w:tc>
+      </w:tr>
+      <w:tr>
+        <w:trPr>
+          <w:trHeight w:val="288"/>
+        </w:trPr>
+        <w:tc>
+          <w:tcPr>
+            <w:tcW w:w="1555" w:type="dxa"/>
+            <w:noWrap/>
+            <w:hideMark/>
+          </w:tcPr>
+          <w:p>
+            <w:pPr>
+              <w:rPr>
+                <w:rFonts w:ascii="Calibri" w:eastAsia="Times New Roman" w:hAnsi="Calibri" w:cs="Calibri"/>
+                <w:color w:val="000000"/>
+                <w:lang w:val="es-CO" w:eastAsia="es-CO"/>
+              </w:rPr>
+            </w:pPr>
+            <w:r>
+              <w:rPr>
+                <w:rFonts w:ascii="Calibri" w:eastAsia="Times New Roman" w:hAnsi="Calibri" w:cs="Calibri"/>
+                <w:color w:val="000000"/>
+                <w:lang w:val="es-CO" w:eastAsia="es-CO"/>
+              </w:rPr>
+              <w:t>(-0.19, -0.14]</w:t>
+            </w:r>
+          </w:p>
+        </w:tc>
+        <w:tc>
+          <w:tcPr>
+            <w:tcW w:w="1275" w:type="dxa"/>
+            <w:noWrap/>
+            <w:hideMark/>
+          </w:tcPr>
+          <w:p>
+            <w:pPr>
+              <w:jc w:val="right"/>
+              <w:rPr>
+                <w:rFonts w:ascii="Calibri" w:eastAsia="Times New Roman" w:hAnsi="Calibri" w:cs="Calibri"/>
+                <w:color w:val="000000"/>
+                <w:lang w:val="es-CO" w:eastAsia="es-CO"/>
+              </w:rPr>
+            </w:pPr>
+            <w:r>
+              <w:rPr>
+                <w:rFonts w:ascii="Calibri" w:eastAsia="Times New Roman" w:hAnsi="Calibri" w:cs="Calibri"/>
+                <w:color w:val="000000"/>
+                <w:lang w:val="es-CO" w:eastAsia="es-CO"/>
+              </w:rPr>
+              <w:t>4</w:t>
+            </w:r>
+          </w:p>
+        </w:tc>
+      </w:tr>
+      <w:tr>
+        <w:trPr>
+          <w:trHeight w:val="288"/>
+        </w:trPr>
+        <w:tc>
+          <w:tcPr>
+            <w:tcW w:w="1555" w:type="dxa"/>
+            <w:noWrap/>
+            <w:hideMark/>
+          </w:tcPr>
+          <w:p>
+            <w:pPr>
+              <w:rPr>
+                <w:rFonts w:ascii="Calibri" w:eastAsia="Times New Roman" w:hAnsi="Calibri" w:cs="Calibri"/>
+                <w:color w:val="000000"/>
+                <w:lang w:val="es-CO" w:eastAsia="es-CO"/>
+              </w:rPr>
+            </w:pPr>
+            <w:r>
+              <w:rPr>
+                <w:rFonts w:ascii="Calibri" w:eastAsia="Times New Roman" w:hAnsi="Calibri" w:cs="Calibri"/>
+                <w:color w:val="000000"/>
+                <w:lang w:val="es-CO" w:eastAsia="es-CO"/>
+              </w:rPr>
+              <w:t>(-0.14, -0.09]</w:t>
+            </w:r>
+          </w:p>
+        </w:tc>
+        <w:tc>
+          <w:tcPr>
+            <w:tcW w:w="1275" w:type="dxa"/>
+            <w:noWrap/>
+            <w:hideMark/>
+          </w:tcPr>
+          <w:p>
+            <w:pPr>
+              <w:jc w:val="right"/>
+              <w:rPr>
+                <w:rFonts w:ascii="Calibri" w:eastAsia="Times New Roman" w:hAnsi="Calibri" w:cs="Calibri"/>
+                <w:color w:val="000000"/>
+                <w:lang w:val="es-CO" w:eastAsia="es-CO"/>
+              </w:rPr>
+            </w:pPr>
+            <w:r>
+              <w:rPr>
+                <w:rFonts w:ascii="Calibri" w:eastAsia="Times New Roman" w:hAnsi="Calibri" w:cs="Calibri"/>
+                <w:color w:val="000000"/>
+                <w:lang w:val="es-CO" w:eastAsia="es-CO"/>
+              </w:rPr>
+              <w:t>1</w:t>
+            </w:r>
+          </w:p>
+        </w:tc>
+      </w:tr>
+      <w:tr>
+        <w:trPr>
+          <w:trHeight w:val="288"/>
+        </w:trPr>
+        <w:tc>
+          <w:tcPr>
+            <w:tcW w:w="1555" w:type="dxa"/>
+            <w:noWrap/>
+            <w:hideMark/>
+          </w:tcPr>
+          <w:p>
+            <w:pPr>
+              <w:rPr>
+                <w:rFonts w:ascii="Calibri" w:eastAsia="Times New Roman" w:hAnsi="Calibri" w:cs="Calibri"/>
+                <w:color w:val="000000"/>
+                <w:lang w:val="es-CO" w:eastAsia="es-CO"/>
+              </w:rPr>
+            </w:pPr>
+            <w:r>
+              <w:rPr>
+                <w:rFonts w:ascii="Calibri" w:eastAsia="Times New Roman" w:hAnsi="Calibri" w:cs="Calibri"/>
+                <w:color w:val="000000"/>
+                <w:lang w:val="es-CO" w:eastAsia="es-CO"/>
+              </w:rPr>
+              <w:t>(-0.09, -0.04]</w:t>
+            </w:r>
+          </w:p>
+        </w:tc>
+        <w:tc>
+          <w:tcPr>
+            <w:tcW w:w="1275" w:type="dxa"/>
+            <w:noWrap/>
+            <w:hideMark/>
+          </w:tcPr>
+          <w:p>
+            <w:pPr>
+              <w:jc w:val="right"/>
+              <w:rPr>
+                <w:rFonts w:ascii="Calibri" w:eastAsia="Times New Roman" w:hAnsi="Calibri" w:cs="Calibri"/>
+                <w:color w:val="000000"/>
+                <w:lang w:val="es-CO" w:eastAsia="es-CO"/>
+              </w:rPr>
+            </w:pPr>
+            <w:r>
+              <w:rPr>
+                <w:rFonts w:ascii="Calibri" w:eastAsia="Times New Roman" w:hAnsi="Calibri" w:cs="Calibri"/>
+                <w:color w:val="000000"/>
+                <w:lang w:val="es-CO" w:eastAsia="es-CO"/>
+              </w:rPr>
+              <w:t>3</w:t>
+            </w:r>
+          </w:p>
+        </w:tc>
+      </w:tr>
+      <w:tr>
+        <w:trPr>
+          <w:trHeight w:val="288"/>
+        </w:trPr>
+        <w:tc>
+          <w:tcPr>
+            <w:tcW w:w="1555" w:type="dxa"/>
+            <w:noWrap/>
+            <w:hideMark/>
+          </w:tcPr>
+          <w:p>
+            <w:pPr>
+              <w:rPr>
+                <w:rFonts w:ascii="Calibri" w:eastAsia="Times New Roman" w:hAnsi="Calibri" w:cs="Calibri"/>
+                <w:color w:val="000000"/>
+                <w:lang w:val="es-CO" w:eastAsia="es-CO"/>
+              </w:rPr>
+            </w:pPr>
+            <w:r>
+              <w:rPr>
+                <w:rFonts w:ascii="Calibri" w:eastAsia="Times New Roman" w:hAnsi="Calibri" w:cs="Calibri"/>
+                <w:color w:val="000000"/>
+                <w:lang w:val="es-CO" w:eastAsia="es-CO"/>
+              </w:rPr>
+              <w:t>(-0.04, 0.01]</w:t>
+            </w:r>
+          </w:p>
+        </w:tc>
+        <w:tc>
+          <w:tcPr>
+            <w:tcW w:w="1275" w:type="dxa"/>
+            <w:noWrap/>
+            <w:hideMark/>
+          </w:tcPr>
+          <w:p>
+            <w:pPr>
+              <w:jc w:val="right"/>
+              <w:rPr>
+                <w:rFonts w:ascii="Calibri" w:eastAsia="Times New Roman" w:hAnsi="Calibri" w:cs="Calibri"/>
+                <w:color w:val="000000"/>
+                <w:lang w:val="es-CO" w:eastAsia="es-CO"/>
+              </w:rPr>
+            </w:pPr>
+            <w:r>
+              <w:rPr>
+                <w:rFonts w:ascii="Calibri" w:eastAsia="Times New Roman" w:hAnsi="Calibri" w:cs="Calibri"/>
+                <w:color w:val="000000"/>
+                <w:lang w:val="es-CO" w:eastAsia="es-CO"/>
+              </w:rPr>
+              <w:t>3</w:t>
+            </w:r>
+          </w:p>
+        </w:tc>
+      </w:tr>
+      <w:tr>
+        <w:trPr>
+          <w:trHeight w:val="288"/>
+        </w:trPr>
+        <w:tc>
+          <w:tcPr>
+            <w:tcW w:w="1555" w:type="dxa"/>
+            <w:noWrap/>
+            <w:hideMark/>
+          </w:tcPr>
+          <w:p>
+            <w:pPr>
+              <w:rPr>
+                <w:rFonts w:ascii="Calibri" w:eastAsia="Times New Roman" w:hAnsi="Calibri" w:cs="Calibri"/>
+                <w:color w:val="000000"/>
+                <w:lang w:val="es-CO" w:eastAsia="es-CO"/>
+              </w:rPr>
+            </w:pPr>
+            <w:r>
+              <w:rPr>
+                <w:rFonts w:ascii="Calibri" w:eastAsia="Times New Roman" w:hAnsi="Calibri" w:cs="Calibri"/>
+                <w:color w:val="000000"/>
+                <w:lang w:val="es-CO" w:eastAsia="es-CO"/>
+              </w:rPr>
+              <w:t>(0.01, 0.06]</w:t>
+            </w:r>
+          </w:p>
+        </w:tc>
+        <w:tc>
+          <w:tcPr>
+            <w:tcW w:w="1275" w:type="dxa"/>
+            <w:noWrap/>
+            <w:hideMark/>
+          </w:tcPr>
+          <w:p>
+            <w:pPr>
+              <w:jc w:val="right"/>
+              <w:rPr>
+                <w:rFonts w:ascii="Calibri" w:eastAsia="Times New Roman" w:hAnsi="Calibri" w:cs="Calibri"/>
+                <w:color w:val="000000"/>
+                <w:lang w:val="es-CO" w:eastAsia="es-CO"/>
+              </w:rPr>
+            </w:pPr>
+            <w:r>
+              <w:rPr>
+                <w:rFonts w:ascii="Calibri" w:eastAsia="Times New Roman" w:hAnsi="Calibri" w:cs="Calibri"/>
+                <w:color w:val="000000"/>
+                <w:lang w:val="es-CO" w:eastAsia="es-CO"/>
+              </w:rPr>
+              <w:t>5</w:t>
+            </w:r>
+          </w:p>
+        </w:tc>
+      </w:tr>
+      <w:tr>
+        <w:trPr>
+          <w:trHeight w:val="288"/>
+        </w:trPr>
+        <w:tc>
+          <w:tcPr>
+            <w:tcW w:w="1555" w:type="dxa"/>
+            <w:noWrap/>
+            <w:hideMark/>
+          </w:tcPr>
+          <w:p>
+            <w:pPr>
+              <w:rPr>
+                <w:rFonts w:ascii="Calibri" w:eastAsia="Times New Roman" w:hAnsi="Calibri" w:cs="Calibri"/>
+                <w:color w:val="000000"/>
+                <w:lang w:val="es-CO" w:eastAsia="es-CO"/>
+              </w:rPr>
+            </w:pPr>
+            <w:r>
+              <w:rPr>
+                <w:rFonts w:ascii="Calibri" w:eastAsia="Times New Roman" w:hAnsi="Calibri" w:cs="Calibri"/>
+                <w:color w:val="000000"/>
+                <w:lang w:val="es-CO" w:eastAsia="es-CO"/>
+              </w:rPr>
+              <w:t>(0.06, 0.11]</w:t>
+            </w:r>
+          </w:p>
+        </w:tc>
+        <w:tc>
+          <w:tcPr>
+            <w:tcW w:w="1275" w:type="dxa"/>
+            <w:noWrap/>
+            <w:hideMark/>
+          </w:tcPr>
+          <w:p>
+            <w:pPr>
+              <w:jc w:val="right"/>
+              <w:rPr>
+                <w:rFonts w:ascii="Calibri" w:eastAsia="Times New Roman" w:hAnsi="Calibri" w:cs="Calibri"/>
+                <w:color w:val="000000"/>
+                <w:lang w:val="es-CO" w:eastAsia="es-CO"/>
+              </w:rPr>
+            </w:pPr>
+            <w:r>
+              <w:rPr>
+                <w:rFonts w:ascii="Calibri" w:eastAsia="Times New Roman" w:hAnsi="Calibri" w:cs="Calibri"/>
+                <w:color w:val="000000"/>
+                <w:lang w:val="es-CO" w:eastAsia="es-CO"/>
+              </w:rPr>
+              <w:t>4</w:t>
+            </w:r>
+          </w:p>
+        </w:tc>
+      </w:tr>
+      <w:tr>
+        <w:trPr>
+          <w:trHeight w:val="288"/>
+        </w:trPr>
+        <w:tc>
+          <w:tcPr>
+            <w:tcW w:w="1555" w:type="dxa"/>
+            <w:noWrap/>
+            <w:hideMark/>
+          </w:tcPr>
+          <w:p>
+            <w:pPr>
+              <w:rPr>
+                <w:rFonts w:ascii="Calibri" w:eastAsia="Times New Roman" w:hAnsi="Calibri" w:cs="Calibri"/>
+                <w:color w:val="000000"/>
+                <w:lang w:val="es-CO" w:eastAsia="es-CO"/>
+              </w:rPr>
+            </w:pPr>
+            <w:r>
+              <w:rPr>
+                <w:rFonts w:ascii="Calibri" w:eastAsia="Times New Roman" w:hAnsi="Calibri" w:cs="Calibri"/>
+                <w:color w:val="000000"/>
+                <w:lang w:val="es-CO" w:eastAsia="es-CO"/>
+              </w:rPr>
+              <w:t>(0.11, 0.16]</w:t>
+            </w:r>
+          </w:p>
+        </w:tc>
+        <w:tc>
+          <w:tcPr>
+            <w:tcW w:w="1275" w:type="dxa"/>
+            <w:noWrap/>
+            <w:hideMark/>
+          </w:tcPr>
+          <w:p>
+            <w:pPr>
+              <w:jc w:val="right"/>
+              <w:rPr>
+                <w:rFonts w:ascii="Calibri" w:eastAsia="Times New Roman" w:hAnsi="Calibri" w:cs="Calibri"/>
+                <w:color w:val="000000"/>
+                <w:lang w:val="es-CO" w:eastAsia="es-CO"/>
+              </w:rPr>
+            </w:pPr>
+            <w:r>
+              <w:rPr>
+                <w:rFonts w:ascii="Calibri" w:eastAsia="Times New Roman" w:hAnsi="Calibri" w:cs="Calibri"/>
+                <w:color w:val="000000"/>
+                <w:lang w:val="es-CO" w:eastAsia="es-CO"/>
+              </w:rPr>
+              <w:t>5</w:t>
+            </w:r>
+          </w:p>
+        </w:tc>
+      </w:tr>
+      <w:tr>
+        <w:trPr>
+          <w:trHeight w:val="288"/>
+        </w:trPr>
+        <w:tc>
+          <w:tcPr>
+            <w:tcW w:w="1555" w:type="dxa"/>
+            <w:noWrap/>
+            <w:hideMark/>
+          </w:tcPr>
+          <w:p>
+            <w:pPr>
+              <w:rPr>
+                <w:rFonts w:ascii="Calibri" w:eastAsia="Times New Roman" w:hAnsi="Calibri" w:cs="Calibri"/>
+                <w:color w:val="000000"/>
+                <w:lang w:val="es-CO" w:eastAsia="es-CO"/>
+              </w:rPr>
+            </w:pPr>
+            <w:r>
+              <w:rPr>
+                <w:rFonts w:ascii="Calibri" w:eastAsia="Times New Roman" w:hAnsi="Calibri" w:cs="Calibri"/>
+                <w:color w:val="000000"/>
+                <w:lang w:val="es-CO" w:eastAsia="es-CO"/>
+              </w:rPr>
+              <w:t>(0.16, 0.21]</w:t>
+            </w:r>
+          </w:p>
+        </w:tc>
+        <w:tc>
+          <w:tcPr>
+            <w:tcW w:w="1275" w:type="dxa"/>
+            <w:noWrap/>
+            <w:hideMark/>
+          </w:tcPr>
+          <w:p>
+            <w:pPr>
+              <w:jc w:val="right"/>
+              <w:rPr>
+                <w:rFonts w:ascii="Calibri" w:eastAsia="Times New Roman" w:hAnsi="Calibri" w:cs="Calibri"/>
+                <w:color w:val="000000"/>
+                <w:lang w:val="es-CO" w:eastAsia="es-CO"/>
+              </w:rPr>
+            </w:pPr>
+            <w:r>
+              <w:rPr>
+                <w:rFonts w:ascii="Calibri" w:eastAsia="Times New Roman" w:hAnsi="Calibri" w:cs="Calibri"/>
+                <w:color w:val="000000"/>
+                <w:lang w:val="es-CO" w:eastAsia="es-CO"/>
+              </w:rPr>
+              <w:t>1</w:t>
+            </w:r>
+          </w:p>
+        </w:tc>
+      </w:tr>
+    </w:tbl>
+    <w:p>
+      <w:pPr>
+        <w:rPr>
+          <w:lang w:val="es-419"/>
+        </w:rPr>
+      </w:pPr>
     </w:p>
     <w:p>
       <w:pPr>
@@ -1398,6 +1971,1089 @@
         <w:rPr>
           <w:lang w:val="es-419"/>
         </w:rPr>
+        <w:t>Table 2. Frecuencias anomalías 1981-2010</w:t>
+      </w:r>
+    </w:p>
+    <w:tbl>
+      <w:tblPr>
+        <w:tblStyle w:val="TableGrid"/>
+        <w:tblW w:w="2830" w:type="dxa"/>
+        <w:tblLook w:val="04A0" w:firstRow="1" w:lastRow="0" w:firstColumn="1" w:lastColumn="0" w:noHBand="0" w:noVBand="1"/>
+      </w:tblPr>
+      <w:tblGrid>
+        <w:gridCol w:w="1555"/>
+        <w:gridCol w:w="1275"/>
+      </w:tblGrid>
+      <w:tr>
+        <w:trPr>
+          <w:trHeight w:val="288"/>
+        </w:trPr>
+        <w:tc>
+          <w:tcPr>
+            <w:tcW w:w="1555" w:type="dxa"/>
+            <w:noWrap/>
+            <w:hideMark/>
+          </w:tcPr>
+          <w:p>
+            <w:pPr>
+              <w:jc w:val="center"/>
+              <w:rPr>
+                <w:rFonts w:ascii="Calibri" w:eastAsia="Times New Roman" w:hAnsi="Calibri" w:cs="Calibri"/>
+                <w:b/>
+                <w:bCs/>
+                <w:color w:val="000000"/>
+                <w:lang w:val="en-GB" w:eastAsia="es-CO"/>
+              </w:rPr>
+            </w:pPr>
+            <w:r>
+              <w:rPr>
+                <w:rFonts w:ascii="Calibri" w:eastAsia="Times New Roman" w:hAnsi="Calibri" w:cs="Calibri"/>
+                <w:b/>
+                <w:bCs/>
+                <w:color w:val="000000"/>
+                <w:lang w:val="en-GB" w:eastAsia="es-CO"/>
+              </w:rPr>
+              <w:t>Range of temperature anomaly (T)</w:t>
+            </w:r>
+          </w:p>
+        </w:tc>
+        <w:tc>
+          <w:tcPr>
+            <w:tcW w:w="1275" w:type="dxa"/>
+            <w:noWrap/>
+            <w:hideMark/>
+          </w:tcPr>
+          <w:p>
+            <w:pPr>
+              <w:jc w:val="center"/>
+              <w:rPr>
+                <w:rFonts w:ascii="Calibri" w:eastAsia="Times New Roman" w:hAnsi="Calibri" w:cs="Calibri"/>
+                <w:b/>
+                <w:bCs/>
+                <w:color w:val="000000"/>
+                <w:lang w:val="es-CO" w:eastAsia="es-CO"/>
+              </w:rPr>
+            </w:pPr>
+            <w:proofErr w:type="spellStart"/>
+            <w:r>
+              <w:rPr>
+                <w:rFonts w:ascii="Calibri" w:eastAsia="Times New Roman" w:hAnsi="Calibri" w:cs="Calibri"/>
+                <w:b/>
+                <w:bCs/>
+                <w:color w:val="000000"/>
+                <w:lang w:val="es-CO" w:eastAsia="es-CO"/>
+              </w:rPr>
+              <w:t>Frequency</w:t>
+            </w:r>
+            <w:proofErr w:type="spellEnd"/>
+          </w:p>
+        </w:tc>
+      </w:tr>
+      <w:tr>
+        <w:trPr>
+          <w:trHeight w:val="288"/>
+        </w:trPr>
+        <w:tc>
+          <w:tcPr>
+            <w:tcW w:w="1555" w:type="dxa"/>
+            <w:noWrap/>
+            <w:hideMark/>
+          </w:tcPr>
+          <w:p>
+            <w:pPr>
+              <w:rPr>
+                <w:rFonts w:ascii="Calibri" w:eastAsia="Times New Roman" w:hAnsi="Calibri" w:cs="Calibri"/>
+                <w:color w:val="000000"/>
+                <w:lang w:val="es-CO" w:eastAsia="es-CO"/>
+              </w:rPr>
+            </w:pPr>
+            <w:r>
+              <w:rPr>
+                <w:rFonts w:ascii="Calibri" w:eastAsia="Times New Roman" w:hAnsi="Calibri" w:cs="Calibri"/>
+                <w:color w:val="000000"/>
+                <w:lang w:val="es-CO" w:eastAsia="es-CO"/>
+              </w:rPr>
+              <w:t>(-0.01, 0.04]</w:t>
+            </w:r>
+          </w:p>
+        </w:tc>
+        <w:tc>
+          <w:tcPr>
+            <w:tcW w:w="1275" w:type="dxa"/>
+            <w:noWrap/>
+            <w:hideMark/>
+          </w:tcPr>
+          <w:p>
+            <w:pPr>
+              <w:jc w:val="right"/>
+              <w:rPr>
+                <w:rFonts w:ascii="Calibri" w:eastAsia="Times New Roman" w:hAnsi="Calibri" w:cs="Calibri"/>
+                <w:color w:val="000000"/>
+                <w:lang w:val="es-CO" w:eastAsia="es-CO"/>
+              </w:rPr>
+            </w:pPr>
+            <w:r>
+              <w:rPr>
+                <w:rFonts w:ascii="Calibri" w:eastAsia="Times New Roman" w:hAnsi="Calibri" w:cs="Calibri"/>
+                <w:color w:val="000000"/>
+                <w:lang w:val="es-CO" w:eastAsia="es-CO"/>
+              </w:rPr>
+              <w:t>2</w:t>
+            </w:r>
+          </w:p>
+        </w:tc>
+      </w:tr>
+      <w:tr>
+        <w:trPr>
+          <w:trHeight w:val="288"/>
+        </w:trPr>
+        <w:tc>
+          <w:tcPr>
+            <w:tcW w:w="1555" w:type="dxa"/>
+            <w:noWrap/>
+            <w:hideMark/>
+          </w:tcPr>
+          <w:p>
+            <w:pPr>
+              <w:rPr>
+                <w:rFonts w:ascii="Calibri" w:eastAsia="Times New Roman" w:hAnsi="Calibri" w:cs="Calibri"/>
+                <w:color w:val="000000"/>
+                <w:lang w:val="es-CO" w:eastAsia="es-CO"/>
+              </w:rPr>
+            </w:pPr>
+            <w:r>
+              <w:rPr>
+                <w:rFonts w:ascii="Calibri" w:eastAsia="Times New Roman" w:hAnsi="Calibri" w:cs="Calibri"/>
+                <w:color w:val="000000"/>
+                <w:lang w:val="es-CO" w:eastAsia="es-CO"/>
+              </w:rPr>
+              <w:t>(0.04, 0.09]</w:t>
+            </w:r>
+          </w:p>
+        </w:tc>
+        <w:tc>
+          <w:tcPr>
+            <w:tcW w:w="1275" w:type="dxa"/>
+            <w:noWrap/>
+            <w:hideMark/>
+          </w:tcPr>
+          <w:p>
+            <w:pPr>
+              <w:jc w:val="right"/>
+              <w:rPr>
+                <w:rFonts w:ascii="Calibri" w:eastAsia="Times New Roman" w:hAnsi="Calibri" w:cs="Calibri"/>
+                <w:color w:val="000000"/>
+                <w:lang w:val="es-CO" w:eastAsia="es-CO"/>
+              </w:rPr>
+            </w:pPr>
+            <w:r>
+              <w:rPr>
+                <w:rFonts w:ascii="Calibri" w:eastAsia="Times New Roman" w:hAnsi="Calibri" w:cs="Calibri"/>
+                <w:color w:val="000000"/>
+                <w:lang w:val="es-CO" w:eastAsia="es-CO"/>
+              </w:rPr>
+              <w:t>1</w:t>
+            </w:r>
+          </w:p>
+        </w:tc>
+      </w:tr>
+      <w:tr>
+        <w:trPr>
+          <w:trHeight w:val="288"/>
+        </w:trPr>
+        <w:tc>
+          <w:tcPr>
+            <w:tcW w:w="1555" w:type="dxa"/>
+            <w:noWrap/>
+            <w:hideMark/>
+          </w:tcPr>
+          <w:p>
+            <w:pPr>
+              <w:rPr>
+                <w:rFonts w:ascii="Calibri" w:eastAsia="Times New Roman" w:hAnsi="Calibri" w:cs="Calibri"/>
+                <w:color w:val="000000"/>
+                <w:lang w:val="es-CO" w:eastAsia="es-CO"/>
+              </w:rPr>
+            </w:pPr>
+            <w:r>
+              <w:rPr>
+                <w:rFonts w:ascii="Calibri" w:eastAsia="Times New Roman" w:hAnsi="Calibri" w:cs="Calibri"/>
+                <w:color w:val="000000"/>
+                <w:lang w:val="es-CO" w:eastAsia="es-CO"/>
+              </w:rPr>
+              <w:t>(0.09, 0.14]</w:t>
+            </w:r>
+          </w:p>
+        </w:tc>
+        <w:tc>
+          <w:tcPr>
+            <w:tcW w:w="1275" w:type="dxa"/>
+            <w:noWrap/>
+            <w:hideMark/>
+          </w:tcPr>
+          <w:p>
+            <w:pPr>
+              <w:jc w:val="right"/>
+              <w:rPr>
+                <w:rFonts w:ascii="Calibri" w:eastAsia="Times New Roman" w:hAnsi="Calibri" w:cs="Calibri"/>
+                <w:color w:val="000000"/>
+                <w:lang w:val="es-CO" w:eastAsia="es-CO"/>
+              </w:rPr>
+            </w:pPr>
+            <w:r>
+              <w:rPr>
+                <w:rFonts w:ascii="Calibri" w:eastAsia="Times New Roman" w:hAnsi="Calibri" w:cs="Calibri"/>
+                <w:color w:val="000000"/>
+                <w:lang w:val="es-CO" w:eastAsia="es-CO"/>
+              </w:rPr>
+              <w:t>2</w:t>
+            </w:r>
+          </w:p>
+        </w:tc>
+      </w:tr>
+      <w:tr>
+        <w:trPr>
+          <w:trHeight w:val="288"/>
+        </w:trPr>
+        <w:tc>
+          <w:tcPr>
+            <w:tcW w:w="1555" w:type="dxa"/>
+            <w:noWrap/>
+            <w:hideMark/>
+          </w:tcPr>
+          <w:p>
+            <w:pPr>
+              <w:rPr>
+                <w:rFonts w:ascii="Calibri" w:eastAsia="Times New Roman" w:hAnsi="Calibri" w:cs="Calibri"/>
+                <w:color w:val="000000"/>
+                <w:lang w:val="es-CO" w:eastAsia="es-CO"/>
+              </w:rPr>
+            </w:pPr>
+            <w:r>
+              <w:rPr>
+                <w:rFonts w:ascii="Calibri" w:eastAsia="Times New Roman" w:hAnsi="Calibri" w:cs="Calibri"/>
+                <w:color w:val="000000"/>
+                <w:lang w:val="es-CO" w:eastAsia="es-CO"/>
+              </w:rPr>
+              <w:t>(0.14, 0.19]</w:t>
+            </w:r>
+          </w:p>
+        </w:tc>
+        <w:tc>
+          <w:tcPr>
+            <w:tcW w:w="1275" w:type="dxa"/>
+            <w:noWrap/>
+            <w:hideMark/>
+          </w:tcPr>
+          <w:p>
+            <w:pPr>
+              <w:jc w:val="right"/>
+              <w:rPr>
+                <w:rFonts w:ascii="Calibri" w:eastAsia="Times New Roman" w:hAnsi="Calibri" w:cs="Calibri"/>
+                <w:color w:val="000000"/>
+                <w:lang w:val="es-CO" w:eastAsia="es-CO"/>
+              </w:rPr>
+            </w:pPr>
+            <w:r>
+              <w:rPr>
+                <w:rFonts w:ascii="Calibri" w:eastAsia="Times New Roman" w:hAnsi="Calibri" w:cs="Calibri"/>
+                <w:color w:val="000000"/>
+                <w:lang w:val="es-CO" w:eastAsia="es-CO"/>
+              </w:rPr>
+              <w:t>1</w:t>
+            </w:r>
+          </w:p>
+        </w:tc>
+      </w:tr>
+      <w:tr>
+        <w:trPr>
+          <w:trHeight w:val="288"/>
+        </w:trPr>
+        <w:tc>
+          <w:tcPr>
+            <w:tcW w:w="1555" w:type="dxa"/>
+            <w:noWrap/>
+            <w:hideMark/>
+          </w:tcPr>
+          <w:p>
+            <w:pPr>
+              <w:rPr>
+                <w:rFonts w:ascii="Calibri" w:eastAsia="Times New Roman" w:hAnsi="Calibri" w:cs="Calibri"/>
+                <w:color w:val="000000"/>
+                <w:lang w:val="es-CO" w:eastAsia="es-CO"/>
+              </w:rPr>
+            </w:pPr>
+            <w:r>
+              <w:rPr>
+                <w:rFonts w:ascii="Calibri" w:eastAsia="Times New Roman" w:hAnsi="Calibri" w:cs="Calibri"/>
+                <w:color w:val="000000"/>
+                <w:lang w:val="es-CO" w:eastAsia="es-CO"/>
+              </w:rPr>
+              <w:t>(0.19, 0.24]</w:t>
+            </w:r>
+          </w:p>
+        </w:tc>
+        <w:tc>
+          <w:tcPr>
+            <w:tcW w:w="1275" w:type="dxa"/>
+            <w:noWrap/>
+            <w:hideMark/>
+          </w:tcPr>
+          <w:p>
+            <w:pPr>
+              <w:jc w:val="right"/>
+              <w:rPr>
+                <w:rFonts w:ascii="Calibri" w:eastAsia="Times New Roman" w:hAnsi="Calibri" w:cs="Calibri"/>
+                <w:color w:val="000000"/>
+                <w:lang w:val="es-CO" w:eastAsia="es-CO"/>
+              </w:rPr>
+            </w:pPr>
+            <w:r>
+              <w:rPr>
+                <w:rFonts w:ascii="Calibri" w:eastAsia="Times New Roman" w:hAnsi="Calibri" w:cs="Calibri"/>
+                <w:color w:val="000000"/>
+                <w:lang w:val="es-CO" w:eastAsia="es-CO"/>
+              </w:rPr>
+              <w:t>0</w:t>
+            </w:r>
+          </w:p>
+        </w:tc>
+      </w:tr>
+      <w:tr>
+        <w:trPr>
+          <w:trHeight w:val="288"/>
+        </w:trPr>
+        <w:tc>
+          <w:tcPr>
+            <w:tcW w:w="1555" w:type="dxa"/>
+            <w:noWrap/>
+            <w:hideMark/>
+          </w:tcPr>
+          <w:p>
+            <w:pPr>
+              <w:rPr>
+                <w:rFonts w:ascii="Calibri" w:eastAsia="Times New Roman" w:hAnsi="Calibri" w:cs="Calibri"/>
+                <w:color w:val="000000"/>
+                <w:lang w:val="es-CO" w:eastAsia="es-CO"/>
+              </w:rPr>
+            </w:pPr>
+            <w:r>
+              <w:rPr>
+                <w:rFonts w:ascii="Calibri" w:eastAsia="Times New Roman" w:hAnsi="Calibri" w:cs="Calibri"/>
+                <w:color w:val="000000"/>
+                <w:lang w:val="es-CO" w:eastAsia="es-CO"/>
+              </w:rPr>
+              <w:t>(0.24, 0.29]</w:t>
+            </w:r>
+          </w:p>
+        </w:tc>
+        <w:tc>
+          <w:tcPr>
+            <w:tcW w:w="1275" w:type="dxa"/>
+            <w:noWrap/>
+            <w:hideMark/>
+          </w:tcPr>
+          <w:p>
+            <w:pPr>
+              <w:jc w:val="right"/>
+              <w:rPr>
+                <w:rFonts w:ascii="Calibri" w:eastAsia="Times New Roman" w:hAnsi="Calibri" w:cs="Calibri"/>
+                <w:color w:val="000000"/>
+                <w:lang w:val="es-CO" w:eastAsia="es-CO"/>
+              </w:rPr>
+            </w:pPr>
+            <w:r>
+              <w:rPr>
+                <w:rFonts w:ascii="Calibri" w:eastAsia="Times New Roman" w:hAnsi="Calibri" w:cs="Calibri"/>
+                <w:color w:val="000000"/>
+                <w:lang w:val="es-CO" w:eastAsia="es-CO"/>
+              </w:rPr>
+              <w:t>4</w:t>
+            </w:r>
+          </w:p>
+        </w:tc>
+      </w:tr>
+      <w:tr>
+        <w:trPr>
+          <w:trHeight w:val="288"/>
+        </w:trPr>
+        <w:tc>
+          <w:tcPr>
+            <w:tcW w:w="1555" w:type="dxa"/>
+            <w:noWrap/>
+            <w:hideMark/>
+          </w:tcPr>
+          <w:p>
+            <w:pPr>
+              <w:rPr>
+                <w:rFonts w:ascii="Calibri" w:eastAsia="Times New Roman" w:hAnsi="Calibri" w:cs="Calibri"/>
+                <w:color w:val="000000"/>
+                <w:lang w:val="es-CO" w:eastAsia="es-CO"/>
+              </w:rPr>
+            </w:pPr>
+            <w:r>
+              <w:rPr>
+                <w:rFonts w:ascii="Calibri" w:eastAsia="Times New Roman" w:hAnsi="Calibri" w:cs="Calibri"/>
+                <w:color w:val="000000"/>
+                <w:lang w:val="es-CO" w:eastAsia="es-CO"/>
+              </w:rPr>
+              <w:t>(0.29, 0.34]</w:t>
+            </w:r>
+          </w:p>
+        </w:tc>
+        <w:tc>
+          <w:tcPr>
+            <w:tcW w:w="1275" w:type="dxa"/>
+            <w:noWrap/>
+            <w:hideMark/>
+          </w:tcPr>
+          <w:p>
+            <w:pPr>
+              <w:jc w:val="right"/>
+              <w:rPr>
+                <w:rFonts w:ascii="Calibri" w:eastAsia="Times New Roman" w:hAnsi="Calibri" w:cs="Calibri"/>
+                <w:color w:val="000000"/>
+                <w:lang w:val="es-CO" w:eastAsia="es-CO"/>
+              </w:rPr>
+            </w:pPr>
+            <w:r>
+              <w:rPr>
+                <w:rFonts w:ascii="Calibri" w:eastAsia="Times New Roman" w:hAnsi="Calibri" w:cs="Calibri"/>
+                <w:color w:val="000000"/>
+                <w:lang w:val="es-CO" w:eastAsia="es-CO"/>
+              </w:rPr>
+              <w:t>0</w:t>
+            </w:r>
+          </w:p>
+        </w:tc>
+      </w:tr>
+      <w:tr>
+        <w:trPr>
+          <w:trHeight w:val="288"/>
+        </w:trPr>
+        <w:tc>
+          <w:tcPr>
+            <w:tcW w:w="1555" w:type="dxa"/>
+            <w:noWrap/>
+            <w:hideMark/>
+          </w:tcPr>
+          <w:p>
+            <w:pPr>
+              <w:rPr>
+                <w:rFonts w:ascii="Calibri" w:eastAsia="Times New Roman" w:hAnsi="Calibri" w:cs="Calibri"/>
+                <w:color w:val="000000"/>
+                <w:lang w:val="es-CO" w:eastAsia="es-CO"/>
+              </w:rPr>
+            </w:pPr>
+            <w:r>
+              <w:rPr>
+                <w:rFonts w:ascii="Calibri" w:eastAsia="Times New Roman" w:hAnsi="Calibri" w:cs="Calibri"/>
+                <w:color w:val="000000"/>
+                <w:lang w:val="es-CO" w:eastAsia="es-CO"/>
+              </w:rPr>
+              <w:t>(0.34, 0.39]</w:t>
+            </w:r>
+          </w:p>
+        </w:tc>
+        <w:tc>
+          <w:tcPr>
+            <w:tcW w:w="1275" w:type="dxa"/>
+            <w:noWrap/>
+            <w:hideMark/>
+          </w:tcPr>
+          <w:p>
+            <w:pPr>
+              <w:jc w:val="right"/>
+              <w:rPr>
+                <w:rFonts w:ascii="Calibri" w:eastAsia="Times New Roman" w:hAnsi="Calibri" w:cs="Calibri"/>
+                <w:color w:val="000000"/>
+                <w:lang w:val="es-CO" w:eastAsia="es-CO"/>
+              </w:rPr>
+            </w:pPr>
+            <w:r>
+              <w:rPr>
+                <w:rFonts w:ascii="Calibri" w:eastAsia="Times New Roman" w:hAnsi="Calibri" w:cs="Calibri"/>
+                <w:color w:val="000000"/>
+                <w:lang w:val="es-CO" w:eastAsia="es-CO"/>
+              </w:rPr>
+              <w:t>3</w:t>
+            </w:r>
+          </w:p>
+        </w:tc>
+      </w:tr>
+      <w:tr>
+        <w:trPr>
+          <w:trHeight w:val="288"/>
+        </w:trPr>
+        <w:tc>
+          <w:tcPr>
+            <w:tcW w:w="1555" w:type="dxa"/>
+            <w:noWrap/>
+            <w:hideMark/>
+          </w:tcPr>
+          <w:p>
+            <w:pPr>
+              <w:rPr>
+                <w:rFonts w:ascii="Calibri" w:eastAsia="Times New Roman" w:hAnsi="Calibri" w:cs="Calibri"/>
+                <w:color w:val="000000"/>
+                <w:lang w:val="es-CO" w:eastAsia="es-CO"/>
+              </w:rPr>
+            </w:pPr>
+            <w:r>
+              <w:rPr>
+                <w:rFonts w:ascii="Calibri" w:eastAsia="Times New Roman" w:hAnsi="Calibri" w:cs="Calibri"/>
+                <w:color w:val="000000"/>
+                <w:lang w:val="es-CO" w:eastAsia="es-CO"/>
+              </w:rPr>
+              <w:t>(0.39, 0.44]</w:t>
+            </w:r>
+          </w:p>
+        </w:tc>
+        <w:tc>
+          <w:tcPr>
+            <w:tcW w:w="1275" w:type="dxa"/>
+            <w:noWrap/>
+            <w:hideMark/>
+          </w:tcPr>
+          <w:p>
+            <w:pPr>
+              <w:jc w:val="right"/>
+              <w:rPr>
+                <w:rFonts w:ascii="Calibri" w:eastAsia="Times New Roman" w:hAnsi="Calibri" w:cs="Calibri"/>
+                <w:color w:val="000000"/>
+                <w:lang w:val="es-CO" w:eastAsia="es-CO"/>
+              </w:rPr>
+            </w:pPr>
+            <w:r>
+              <w:rPr>
+                <w:rFonts w:ascii="Calibri" w:eastAsia="Times New Roman" w:hAnsi="Calibri" w:cs="Calibri"/>
+                <w:color w:val="000000"/>
+                <w:lang w:val="es-CO" w:eastAsia="es-CO"/>
+              </w:rPr>
+              <w:t>1</w:t>
+            </w:r>
+          </w:p>
+        </w:tc>
+      </w:tr>
+      <w:tr>
+        <w:trPr>
+          <w:trHeight w:val="288"/>
+        </w:trPr>
+        <w:tc>
+          <w:tcPr>
+            <w:tcW w:w="1555" w:type="dxa"/>
+            <w:noWrap/>
+            <w:hideMark/>
+          </w:tcPr>
+          <w:p>
+            <w:pPr>
+              <w:rPr>
+                <w:rFonts w:ascii="Calibri" w:eastAsia="Times New Roman" w:hAnsi="Calibri" w:cs="Calibri"/>
+                <w:color w:val="000000"/>
+                <w:lang w:val="es-CO" w:eastAsia="es-CO"/>
+              </w:rPr>
+            </w:pPr>
+            <w:r>
+              <w:rPr>
+                <w:rFonts w:ascii="Calibri" w:eastAsia="Times New Roman" w:hAnsi="Calibri" w:cs="Calibri"/>
+                <w:color w:val="000000"/>
+                <w:lang w:val="es-CO" w:eastAsia="es-CO"/>
+              </w:rPr>
+              <w:t>(0.44, 0.49]</w:t>
+            </w:r>
+          </w:p>
+        </w:tc>
+        <w:tc>
+          <w:tcPr>
+            <w:tcW w:w="1275" w:type="dxa"/>
+            <w:noWrap/>
+            <w:hideMark/>
+          </w:tcPr>
+          <w:p>
+            <w:pPr>
+              <w:jc w:val="right"/>
+              <w:rPr>
+                <w:rFonts w:ascii="Calibri" w:eastAsia="Times New Roman" w:hAnsi="Calibri" w:cs="Calibri"/>
+                <w:color w:val="000000"/>
+                <w:lang w:val="es-CO" w:eastAsia="es-CO"/>
+              </w:rPr>
+            </w:pPr>
+            <w:r>
+              <w:rPr>
+                <w:rFonts w:ascii="Calibri" w:eastAsia="Times New Roman" w:hAnsi="Calibri" w:cs="Calibri"/>
+                <w:color w:val="000000"/>
+                <w:lang w:val="es-CO" w:eastAsia="es-CO"/>
+              </w:rPr>
+              <w:t>1</w:t>
+            </w:r>
+          </w:p>
+        </w:tc>
+      </w:tr>
+      <w:tr>
+        <w:trPr>
+          <w:trHeight w:val="288"/>
+        </w:trPr>
+        <w:tc>
+          <w:tcPr>
+            <w:tcW w:w="1555" w:type="dxa"/>
+            <w:noWrap/>
+            <w:hideMark/>
+          </w:tcPr>
+          <w:p>
+            <w:pPr>
+              <w:rPr>
+                <w:rFonts w:ascii="Calibri" w:eastAsia="Times New Roman" w:hAnsi="Calibri" w:cs="Calibri"/>
+                <w:color w:val="000000"/>
+                <w:lang w:val="es-CO" w:eastAsia="es-CO"/>
+              </w:rPr>
+            </w:pPr>
+            <w:r>
+              <w:rPr>
+                <w:rFonts w:ascii="Calibri" w:eastAsia="Times New Roman" w:hAnsi="Calibri" w:cs="Calibri"/>
+                <w:color w:val="000000"/>
+                <w:lang w:val="es-CO" w:eastAsia="es-CO"/>
+              </w:rPr>
+              <w:t>(0.49, 0.54]</w:t>
+            </w:r>
+          </w:p>
+        </w:tc>
+        <w:tc>
+          <w:tcPr>
+            <w:tcW w:w="1275" w:type="dxa"/>
+            <w:noWrap/>
+            <w:hideMark/>
+          </w:tcPr>
+          <w:p>
+            <w:pPr>
+              <w:jc w:val="right"/>
+              <w:rPr>
+                <w:rFonts w:ascii="Calibri" w:eastAsia="Times New Roman" w:hAnsi="Calibri" w:cs="Calibri"/>
+                <w:color w:val="000000"/>
+                <w:lang w:val="es-CO" w:eastAsia="es-CO"/>
+              </w:rPr>
+            </w:pPr>
+            <w:r>
+              <w:rPr>
+                <w:rFonts w:ascii="Calibri" w:eastAsia="Times New Roman" w:hAnsi="Calibri" w:cs="Calibri"/>
+                <w:color w:val="000000"/>
+                <w:lang w:val="es-CO" w:eastAsia="es-CO"/>
+              </w:rPr>
+              <w:t>3</w:t>
+            </w:r>
+          </w:p>
+        </w:tc>
+      </w:tr>
+      <w:tr>
+        <w:trPr>
+          <w:trHeight w:val="288"/>
+        </w:trPr>
+        <w:tc>
+          <w:tcPr>
+            <w:tcW w:w="1555" w:type="dxa"/>
+            <w:noWrap/>
+            <w:hideMark/>
+          </w:tcPr>
+          <w:p>
+            <w:pPr>
+              <w:rPr>
+                <w:rFonts w:ascii="Calibri" w:eastAsia="Times New Roman" w:hAnsi="Calibri" w:cs="Calibri"/>
+                <w:color w:val="000000"/>
+                <w:lang w:val="es-CO" w:eastAsia="es-CO"/>
+              </w:rPr>
+            </w:pPr>
+            <w:r>
+              <w:rPr>
+                <w:rFonts w:ascii="Calibri" w:eastAsia="Times New Roman" w:hAnsi="Calibri" w:cs="Calibri"/>
+                <w:color w:val="000000"/>
+                <w:lang w:val="es-CO" w:eastAsia="es-CO"/>
+              </w:rPr>
+              <w:t>(0.54, 0.59]</w:t>
+            </w:r>
+          </w:p>
+        </w:tc>
+        <w:tc>
+          <w:tcPr>
+            <w:tcW w:w="1275" w:type="dxa"/>
+            <w:noWrap/>
+            <w:hideMark/>
+          </w:tcPr>
+          <w:p>
+            <w:pPr>
+              <w:jc w:val="right"/>
+              <w:rPr>
+                <w:rFonts w:ascii="Calibri" w:eastAsia="Times New Roman" w:hAnsi="Calibri" w:cs="Calibri"/>
+                <w:color w:val="000000"/>
+                <w:lang w:val="es-CO" w:eastAsia="es-CO"/>
+              </w:rPr>
+            </w:pPr>
+            <w:r>
+              <w:rPr>
+                <w:rFonts w:ascii="Calibri" w:eastAsia="Times New Roman" w:hAnsi="Calibri" w:cs="Calibri"/>
+                <w:color w:val="000000"/>
+                <w:lang w:val="es-CO" w:eastAsia="es-CO"/>
+              </w:rPr>
+              <w:t>1</w:t>
+            </w:r>
+          </w:p>
+        </w:tc>
+      </w:tr>
+      <w:tr>
+        <w:trPr>
+          <w:trHeight w:val="288"/>
+        </w:trPr>
+        <w:tc>
+          <w:tcPr>
+            <w:tcW w:w="1555" w:type="dxa"/>
+            <w:noWrap/>
+            <w:hideMark/>
+          </w:tcPr>
+          <w:p>
+            <w:pPr>
+              <w:rPr>
+                <w:rFonts w:ascii="Calibri" w:eastAsia="Times New Roman" w:hAnsi="Calibri" w:cs="Calibri"/>
+                <w:color w:val="000000"/>
+                <w:lang w:val="es-CO" w:eastAsia="es-CO"/>
+              </w:rPr>
+            </w:pPr>
+            <w:r>
+              <w:rPr>
+                <w:rFonts w:ascii="Calibri" w:eastAsia="Times New Roman" w:hAnsi="Calibri" w:cs="Calibri"/>
+                <w:color w:val="000000"/>
+                <w:lang w:val="es-CO" w:eastAsia="es-CO"/>
+              </w:rPr>
+              <w:t>(0.59, 0.64]</w:t>
+            </w:r>
+          </w:p>
+        </w:tc>
+        <w:tc>
+          <w:tcPr>
+            <w:tcW w:w="1275" w:type="dxa"/>
+            <w:noWrap/>
+            <w:hideMark/>
+          </w:tcPr>
+          <w:p>
+            <w:pPr>
+              <w:jc w:val="right"/>
+              <w:rPr>
+                <w:rFonts w:ascii="Calibri" w:eastAsia="Times New Roman" w:hAnsi="Calibri" w:cs="Calibri"/>
+                <w:color w:val="000000"/>
+                <w:lang w:val="es-CO" w:eastAsia="es-CO"/>
+              </w:rPr>
+            </w:pPr>
+            <w:r>
+              <w:rPr>
+                <w:rFonts w:ascii="Calibri" w:eastAsia="Times New Roman" w:hAnsi="Calibri" w:cs="Calibri"/>
+                <w:color w:val="000000"/>
+                <w:lang w:val="es-CO" w:eastAsia="es-CO"/>
+              </w:rPr>
+              <w:t>1</w:t>
+            </w:r>
+          </w:p>
+        </w:tc>
+      </w:tr>
+      <w:tr>
+        <w:trPr>
+          <w:trHeight w:val="288"/>
+        </w:trPr>
+        <w:tc>
+          <w:tcPr>
+            <w:tcW w:w="1555" w:type="dxa"/>
+            <w:noWrap/>
+            <w:hideMark/>
+          </w:tcPr>
+          <w:p>
+            <w:pPr>
+              <w:rPr>
+                <w:rFonts w:ascii="Calibri" w:eastAsia="Times New Roman" w:hAnsi="Calibri" w:cs="Calibri"/>
+                <w:color w:val="000000"/>
+                <w:lang w:val="es-CO" w:eastAsia="es-CO"/>
+              </w:rPr>
+            </w:pPr>
+            <w:r>
+              <w:rPr>
+                <w:rFonts w:ascii="Calibri" w:eastAsia="Times New Roman" w:hAnsi="Calibri" w:cs="Calibri"/>
+                <w:color w:val="000000"/>
+                <w:lang w:val="es-CO" w:eastAsia="es-CO"/>
+              </w:rPr>
+              <w:lastRenderedPageBreak/>
+              <w:t>(0.64, 0.69]</w:t>
+            </w:r>
+          </w:p>
+        </w:tc>
+        <w:tc>
+          <w:tcPr>
+            <w:tcW w:w="1275" w:type="dxa"/>
+            <w:noWrap/>
+            <w:hideMark/>
+          </w:tcPr>
+          <w:p>
+            <w:pPr>
+              <w:jc w:val="right"/>
+              <w:rPr>
+                <w:rFonts w:ascii="Calibri" w:eastAsia="Times New Roman" w:hAnsi="Calibri" w:cs="Calibri"/>
+                <w:color w:val="000000"/>
+                <w:lang w:val="es-CO" w:eastAsia="es-CO"/>
+              </w:rPr>
+            </w:pPr>
+            <w:r>
+              <w:rPr>
+                <w:rFonts w:ascii="Calibri" w:eastAsia="Times New Roman" w:hAnsi="Calibri" w:cs="Calibri"/>
+                <w:color w:val="000000"/>
+                <w:lang w:val="es-CO" w:eastAsia="es-CO"/>
+              </w:rPr>
+              <w:t>2</w:t>
+            </w:r>
+          </w:p>
+        </w:tc>
+      </w:tr>
+      <w:tr>
+        <w:trPr>
+          <w:trHeight w:val="288"/>
+        </w:trPr>
+        <w:tc>
+          <w:tcPr>
+            <w:tcW w:w="1555" w:type="dxa"/>
+            <w:noWrap/>
+            <w:hideMark/>
+          </w:tcPr>
+          <w:p>
+            <w:pPr>
+              <w:rPr>
+                <w:rFonts w:ascii="Calibri" w:eastAsia="Times New Roman" w:hAnsi="Calibri" w:cs="Calibri"/>
+                <w:color w:val="000000"/>
+                <w:lang w:val="es-CO" w:eastAsia="es-CO"/>
+              </w:rPr>
+            </w:pPr>
+            <w:r>
+              <w:rPr>
+                <w:rFonts w:ascii="Calibri" w:eastAsia="Times New Roman" w:hAnsi="Calibri" w:cs="Calibri"/>
+                <w:color w:val="000000"/>
+                <w:lang w:val="es-CO" w:eastAsia="es-CO"/>
+              </w:rPr>
+              <w:t>(0.69, 0.74]</w:t>
+            </w:r>
+          </w:p>
+        </w:tc>
+        <w:tc>
+          <w:tcPr>
+            <w:tcW w:w="1275" w:type="dxa"/>
+            <w:noWrap/>
+            <w:hideMark/>
+          </w:tcPr>
+          <w:p>
+            <w:pPr>
+              <w:jc w:val="right"/>
+              <w:rPr>
+                <w:rFonts w:ascii="Calibri" w:eastAsia="Times New Roman" w:hAnsi="Calibri" w:cs="Calibri"/>
+                <w:color w:val="000000"/>
+                <w:lang w:val="es-CO" w:eastAsia="es-CO"/>
+              </w:rPr>
+            </w:pPr>
+            <w:r>
+              <w:rPr>
+                <w:rFonts w:ascii="Calibri" w:eastAsia="Times New Roman" w:hAnsi="Calibri" w:cs="Calibri"/>
+                <w:color w:val="000000"/>
+                <w:lang w:val="es-CO" w:eastAsia="es-CO"/>
+              </w:rPr>
+              <w:t>3</w:t>
+            </w:r>
+          </w:p>
+        </w:tc>
+      </w:tr>
+      <w:tr>
+        <w:trPr>
+          <w:trHeight w:val="288"/>
+        </w:trPr>
+        <w:tc>
+          <w:tcPr>
+            <w:tcW w:w="1555" w:type="dxa"/>
+            <w:noWrap/>
+            <w:hideMark/>
+          </w:tcPr>
+          <w:p>
+            <w:pPr>
+              <w:rPr>
+                <w:rFonts w:ascii="Calibri" w:eastAsia="Times New Roman" w:hAnsi="Calibri" w:cs="Calibri"/>
+                <w:color w:val="000000"/>
+                <w:lang w:val="es-CO" w:eastAsia="es-CO"/>
+              </w:rPr>
+            </w:pPr>
+            <w:r>
+              <w:rPr>
+                <w:rFonts w:ascii="Calibri" w:eastAsia="Times New Roman" w:hAnsi="Calibri" w:cs="Calibri"/>
+                <w:color w:val="000000"/>
+                <w:lang w:val="es-CO" w:eastAsia="es-CO"/>
+              </w:rPr>
+              <w:t>(0.74, 0.79]</w:t>
+            </w:r>
+          </w:p>
+        </w:tc>
+        <w:tc>
+          <w:tcPr>
+            <w:tcW w:w="1275" w:type="dxa"/>
+            <w:noWrap/>
+            <w:hideMark/>
+          </w:tcPr>
+          <w:p>
+            <w:pPr>
+              <w:jc w:val="right"/>
+              <w:rPr>
+                <w:rFonts w:ascii="Calibri" w:eastAsia="Times New Roman" w:hAnsi="Calibri" w:cs="Calibri"/>
+                <w:color w:val="000000"/>
+                <w:lang w:val="es-CO" w:eastAsia="es-CO"/>
+              </w:rPr>
+            </w:pPr>
+            <w:r>
+              <w:rPr>
+                <w:rFonts w:ascii="Calibri" w:eastAsia="Times New Roman" w:hAnsi="Calibri" w:cs="Calibri"/>
+                <w:color w:val="000000"/>
+                <w:lang w:val="es-CO" w:eastAsia="es-CO"/>
+              </w:rPr>
+              <w:t>1</w:t>
+            </w:r>
+          </w:p>
+        </w:tc>
+      </w:tr>
+      <w:tr>
+        <w:trPr>
+          <w:trHeight w:val="288"/>
+        </w:trPr>
+        <w:tc>
+          <w:tcPr>
+            <w:tcW w:w="1555" w:type="dxa"/>
+            <w:noWrap/>
+            <w:hideMark/>
+          </w:tcPr>
+          <w:p>
+            <w:pPr>
+              <w:rPr>
+                <w:rFonts w:ascii="Calibri" w:eastAsia="Times New Roman" w:hAnsi="Calibri" w:cs="Calibri"/>
+                <w:color w:val="000000"/>
+                <w:lang w:val="es-CO" w:eastAsia="es-CO"/>
+              </w:rPr>
+            </w:pPr>
+            <w:r>
+              <w:rPr>
+                <w:rFonts w:ascii="Calibri" w:eastAsia="Times New Roman" w:hAnsi="Calibri" w:cs="Calibri"/>
+                <w:color w:val="000000"/>
+                <w:lang w:val="es-CO" w:eastAsia="es-CO"/>
+              </w:rPr>
+              <w:t>(0.79, 0.84]</w:t>
+            </w:r>
+          </w:p>
+        </w:tc>
+        <w:tc>
+          <w:tcPr>
+            <w:tcW w:w="1275" w:type="dxa"/>
+            <w:noWrap/>
+            <w:hideMark/>
+          </w:tcPr>
+          <w:p>
+            <w:pPr>
+              <w:jc w:val="right"/>
+              <w:rPr>
+                <w:rFonts w:ascii="Calibri" w:eastAsia="Times New Roman" w:hAnsi="Calibri" w:cs="Calibri"/>
+                <w:color w:val="000000"/>
+                <w:lang w:val="es-CO" w:eastAsia="es-CO"/>
+              </w:rPr>
+            </w:pPr>
+            <w:r>
+              <w:rPr>
+                <w:rFonts w:ascii="Calibri" w:eastAsia="Times New Roman" w:hAnsi="Calibri" w:cs="Calibri"/>
+                <w:color w:val="000000"/>
+                <w:lang w:val="es-CO" w:eastAsia="es-CO"/>
+              </w:rPr>
+              <w:t>1</w:t>
+            </w:r>
+          </w:p>
+        </w:tc>
+      </w:tr>
+      <w:tr>
+        <w:trPr>
+          <w:trHeight w:val="288"/>
+        </w:trPr>
+        <w:tc>
+          <w:tcPr>
+            <w:tcW w:w="1555" w:type="dxa"/>
+            <w:noWrap/>
+            <w:hideMark/>
+          </w:tcPr>
+          <w:p>
+            <w:pPr>
+              <w:rPr>
+                <w:rFonts w:ascii="Calibri" w:eastAsia="Times New Roman" w:hAnsi="Calibri" w:cs="Calibri"/>
+                <w:color w:val="000000"/>
+                <w:lang w:val="es-CO" w:eastAsia="es-CO"/>
+              </w:rPr>
+            </w:pPr>
+            <w:r>
+              <w:rPr>
+                <w:rFonts w:ascii="Calibri" w:eastAsia="Times New Roman" w:hAnsi="Calibri" w:cs="Calibri"/>
+                <w:color w:val="000000"/>
+                <w:lang w:val="es-CO" w:eastAsia="es-CO"/>
+              </w:rPr>
+              <w:t>(0.84, 0.89]</w:t>
+            </w:r>
+          </w:p>
+        </w:tc>
+        <w:tc>
+          <w:tcPr>
+            <w:tcW w:w="1275" w:type="dxa"/>
+            <w:noWrap/>
+            <w:hideMark/>
+          </w:tcPr>
+          <w:p>
+            <w:pPr>
+              <w:jc w:val="right"/>
+              <w:rPr>
+                <w:rFonts w:ascii="Calibri" w:eastAsia="Times New Roman" w:hAnsi="Calibri" w:cs="Calibri"/>
+                <w:color w:val="000000"/>
+                <w:lang w:val="es-CO" w:eastAsia="es-CO"/>
+              </w:rPr>
+            </w:pPr>
+            <w:r>
+              <w:rPr>
+                <w:rFonts w:ascii="Calibri" w:eastAsia="Times New Roman" w:hAnsi="Calibri" w:cs="Calibri"/>
+                <w:color w:val="000000"/>
+                <w:lang w:val="es-CO" w:eastAsia="es-CO"/>
+              </w:rPr>
+              <w:t>2</w:t>
+            </w:r>
+          </w:p>
+        </w:tc>
+      </w:tr>
+    </w:tbl>
+    <w:p>
+      <w:pPr>
+        <w:rPr>
+          <w:lang w:val="es-419"/>
+        </w:rPr>
+      </w:pPr>
+    </w:p>
+    <w:p>
+      <w:pPr>
+        <w:pStyle w:val="Heading3"/>
+        <w:rPr>
+          <w:lang w:val="es-419"/>
+        </w:rPr>
+      </w:pPr>
+      <w:r>
+        <w:rPr>
+          <w:lang w:val="es-419"/>
+        </w:rPr>
+        <w:t>Pregunta 1.2.2</w:t>
+      </w:r>
+    </w:p>
+    <w:p>
+      <w:pPr>
+        <w:rPr>
+          <w:lang w:val="es-419"/>
+        </w:rPr>
+      </w:pPr>
+      <w:r>
+        <w:rPr>
+          <w:lang w:val="es-419"/>
+        </w:rPr>
         <w:t>Con las tablas de frecuencias:</w:t>
       </w:r>
       <w:r>
@@ -1407,6 +3063,67 @@
         <w:br/>
         <w:t>- Construye dos histogramas (1951–1980 y 1981–2010) mostrando la distribución de anomalías de temperatura.</w:t>
       </w:r>
+    </w:p>
+    <w:p>
+      <w:pPr>
+        <w:rPr>
+          <w:lang w:val="es-419"/>
+        </w:rPr>
+      </w:pPr>
+      <w:r>
+        <w:rPr>
+          <w:noProof/>
+          <w:lang w:val="es-419"/>
+        </w:rPr>
+        <w:drawing>
+          <wp:inline distT="0" distB="0" distL="0" distR="0" wp14:anchorId="399813C7" wp14:editId="6824DCB2">
+            <wp:extent cx="5440680" cy="2712720"/>
+            <wp:effectExtent l="0" t="0" r="7620" b="0"/>
+            <wp:docPr id="1677217729" name="Picture 1"/>
+            <wp:cNvGraphicFramePr>
+              <a:graphicFrameLocks xmlns:a="http://schemas.openxmlformats.org/drawingml/2006/main" noChangeAspect="1"/>
+            </wp:cNvGraphicFramePr>
+            <a:graphic xmlns:a="http://schemas.openxmlformats.org/drawingml/2006/main">
+              <a:graphicData uri="http://schemas.openxmlformats.org/drawingml/2006/picture">
+                <pic:pic xmlns:pic="http://schemas.openxmlformats.org/drawingml/2006/picture">
+                  <pic:nvPicPr>
+                    <pic:cNvPr id="0" name="Picture 1"/>
+                    <pic:cNvPicPr>
+                      <a:picLocks noChangeAspect="1" noChangeArrowheads="1"/>
+                    </pic:cNvPicPr>
+                  </pic:nvPicPr>
+                  <pic:blipFill>
+                    <a:blip r:embed="rId16">
+                      <a:extLst>
+                        <a:ext uri="{28A0092B-C50C-407E-A947-70E740481C1C}">
+                          <a14:useLocalDpi xmlns:a14="http://schemas.microsoft.com/office/drawing/2010/main" val="0"/>
+                        </a:ext>
+                      </a:extLst>
+                    </a:blip>
+                    <a:srcRect/>
+                    <a:stretch>
+                      <a:fillRect/>
+                    </a:stretch>
+                  </pic:blipFill>
+                  <pic:spPr bwMode="auto">
+                    <a:xfrm>
+                      <a:off x="0" y="0"/>
+                      <a:ext cx="5440680" cy="2712720"/>
+                    </a:xfrm>
+                    <a:prstGeom prst="rect">
+                      <a:avLst/>
+                    </a:prstGeom>
+                    <a:noFill/>
+                    <a:ln>
+                      <a:noFill/>
+                    </a:ln>
+                  </pic:spPr>
+                </pic:pic>
+              </a:graphicData>
+            </a:graphic>
+          </wp:inline>
+        </w:drawing>
+      </w:r>
       <w:r>
         <w:rPr>
           <w:lang w:val="es-419"/>
@@ -1429,16 +3146,17 @@
     </w:p>
     <w:p>
       <w:pPr>
-        <w:pStyle w:val="Heading3"/>
-        <w:rPr>
-          <w:lang w:val="es-419"/>
-        </w:rPr>
-      </w:pPr>
-      <w:r>
-        <w:rPr>
-          <w:lang w:val="es-419"/>
-        </w:rPr>
-        <w:t>Pregunta 1.2.3</w:t>
+        <w:rPr>
+          <w:highlight w:val="yellow"/>
+          <w:lang w:val="es-419"/>
+        </w:rPr>
+      </w:pPr>
+      <w:r>
+        <w:rPr>
+          <w:highlight w:val="yellow"/>
+          <w:lang w:val="es-419"/>
+        </w:rPr>
+        <w:t>Las principales diferencias entre los gráficos se observan en la centralidad de los valores respecto a la media. En el periodo de 1951–1980, la anomalía de temperatura presenta valores tanto por debajo como por encima de cero, lo que indica una mayor variabilidad alrededor de la media y sugiere la presencia tanto de periodos fríos como de periodos cálidos.</w:t>
       </w:r>
     </w:p>
     <w:p>
@@ -1449,6 +3167,34 @@
       </w:pPr>
       <w:r>
         <w:rPr>
+          <w:highlight w:val="yellow"/>
+          <w:lang w:val="es-419"/>
+        </w:rPr>
+        <w:t>Por otra parte, en el periodo de 1981–2010 la distribución concentra la mayoría de sus valores en el lado de anomalías positivas. Esto implica una tendencia hacia temperaturas más altas durante este periodo, evidenciando que las personas convivieron con temperaturas superiores al promedio histórico. En conjunto, este desplazamiento de la distribución hacia valores positivos sugiere un aumento generalizado de las temperaturas, consistente con los patrones asociados al cambio climático.</w:t>
+      </w:r>
+    </w:p>
+    <w:p>
+      <w:pPr>
+        <w:pStyle w:val="Heading3"/>
+        <w:rPr>
+          <w:lang w:val="es-419"/>
+        </w:rPr>
+      </w:pPr>
+      <w:r>
+        <w:rPr>
+          <w:lang w:val="es-419"/>
+        </w:rPr>
+        <w:t>Pregunta 1.2.3</w:t>
+      </w:r>
+    </w:p>
+    <w:p>
+      <w:pPr>
+        <w:rPr>
+          <w:lang w:val="es-419"/>
+        </w:rPr>
+      </w:pPr>
+      <w:r>
+        <w:rPr>
           <w:lang w:val="es-419"/>
         </w:rPr>
         <w:t>El artículo del New York Times clasifica el tercio inferior (1er al 3er decil) como “frío” y el tercio superior (7º al 10º decil) como “caliente”.</w:t>
@@ -1458,6 +3204,12 @@
           <w:lang w:val="es-419"/>
         </w:rPr>
         <w:br/>
+      </w:r>
+      <w:r>
+        <w:rPr>
+          <w:lang w:val="es-419"/>
+        </w:rPr>
+        <w:lastRenderedPageBreak/>
         <w:t xml:space="preserve">- Usa la función </w:t>
       </w:r>
       <w:proofErr w:type="spellStart"/>
@@ -1521,22 +3273,329 @@
         <w:t xml:space="preserve"> para encontrar los valores correspondientes a los deciles 3 y 7 en 1951–1980.</w:t>
       </w:r>
     </w:p>
+    <w:tbl>
+      <w:tblPr>
+        <w:tblStyle w:val="TableGrid"/>
+        <w:tblW w:w="3148" w:type="dxa"/>
+        <w:tblLook w:val="04A0" w:firstRow="1" w:lastRow="0" w:firstColumn="1" w:lastColumn="0" w:noHBand="0" w:noVBand="1"/>
+      </w:tblPr>
+      <w:tblGrid>
+        <w:gridCol w:w="960"/>
+        <w:gridCol w:w="1007"/>
+        <w:gridCol w:w="1414"/>
+      </w:tblGrid>
+      <w:tr>
+        <w:trPr>
+          <w:trHeight w:val="288"/>
+        </w:trPr>
+        <w:tc>
+          <w:tcPr>
+            <w:tcW w:w="960" w:type="dxa"/>
+            <w:noWrap/>
+            <w:hideMark/>
+          </w:tcPr>
+          <w:p>
+            <w:pPr>
+              <w:jc w:val="center"/>
+              <w:rPr>
+                <w:rFonts w:ascii="Calibri" w:eastAsia="Times New Roman" w:hAnsi="Calibri" w:cs="Calibri"/>
+                <w:b/>
+                <w:bCs/>
+                <w:color w:val="000000"/>
+                <w:lang w:val="es-CO" w:eastAsia="es-CO"/>
+              </w:rPr>
+            </w:pPr>
+            <w:proofErr w:type="spellStart"/>
+            <w:r>
+              <w:rPr>
+                <w:rFonts w:ascii="Calibri" w:eastAsia="Times New Roman" w:hAnsi="Calibri" w:cs="Calibri"/>
+                <w:b/>
+                <w:bCs/>
+                <w:color w:val="000000"/>
+                <w:lang w:val="es-CO" w:eastAsia="es-CO"/>
+              </w:rPr>
+              <w:t>Decile</w:t>
+            </w:r>
+            <w:proofErr w:type="spellEnd"/>
+          </w:p>
+        </w:tc>
+        <w:tc>
+          <w:tcPr>
+            <w:tcW w:w="960" w:type="dxa"/>
+            <w:noWrap/>
+            <w:hideMark/>
+          </w:tcPr>
+          <w:p>
+            <w:pPr>
+              <w:jc w:val="center"/>
+              <w:rPr>
+                <w:rFonts w:ascii="Calibri" w:eastAsia="Times New Roman" w:hAnsi="Calibri" w:cs="Calibri"/>
+                <w:b/>
+                <w:bCs/>
+                <w:color w:val="000000"/>
+                <w:lang w:val="es-CO" w:eastAsia="es-CO"/>
+              </w:rPr>
+            </w:pPr>
+            <w:proofErr w:type="spellStart"/>
+            <w:r>
+              <w:rPr>
+                <w:rFonts w:ascii="Calibri" w:eastAsia="Times New Roman" w:hAnsi="Calibri" w:cs="Calibri"/>
+                <w:b/>
+                <w:bCs/>
+                <w:color w:val="000000"/>
+                <w:lang w:val="es-CO" w:eastAsia="es-CO"/>
+              </w:rPr>
+              <w:t>Quantile</w:t>
+            </w:r>
+            <w:proofErr w:type="spellEnd"/>
+          </w:p>
+        </w:tc>
+        <w:tc>
+          <w:tcPr>
+            <w:tcW w:w="1228" w:type="dxa"/>
+            <w:noWrap/>
+            <w:hideMark/>
+          </w:tcPr>
+          <w:p>
+            <w:pPr>
+              <w:jc w:val="center"/>
+              <w:rPr>
+                <w:rFonts w:ascii="Calibri" w:eastAsia="Times New Roman" w:hAnsi="Calibri" w:cs="Calibri"/>
+                <w:b/>
+                <w:bCs/>
+                <w:color w:val="000000"/>
+                <w:lang w:val="es-CO" w:eastAsia="es-CO"/>
+              </w:rPr>
+            </w:pPr>
+            <w:proofErr w:type="spellStart"/>
+            <w:r>
+              <w:rPr>
+                <w:rFonts w:ascii="Calibri" w:eastAsia="Times New Roman" w:hAnsi="Calibri" w:cs="Calibri"/>
+                <w:b/>
+                <w:bCs/>
+                <w:color w:val="000000"/>
+                <w:lang w:val="es-CO" w:eastAsia="es-CO"/>
+              </w:rPr>
+              <w:t>Temperature</w:t>
+            </w:r>
+            <w:proofErr w:type="spellEnd"/>
+            <w:r>
+              <w:rPr>
+                <w:rFonts w:ascii="Calibri" w:eastAsia="Times New Roman" w:hAnsi="Calibri" w:cs="Calibri"/>
+                <w:b/>
+                <w:bCs/>
+                <w:color w:val="000000"/>
+                <w:lang w:val="es-CO" w:eastAsia="es-CO"/>
+              </w:rPr>
+              <w:t xml:space="preserve"> </w:t>
+            </w:r>
+            <w:proofErr w:type="spellStart"/>
+            <w:r>
+              <w:rPr>
+                <w:rFonts w:ascii="Calibri" w:eastAsia="Times New Roman" w:hAnsi="Calibri" w:cs="Calibri"/>
+                <w:b/>
+                <w:bCs/>
+                <w:color w:val="000000"/>
+                <w:lang w:val="es-CO" w:eastAsia="es-CO"/>
+              </w:rPr>
+              <w:t>anomaly</w:t>
+            </w:r>
+            <w:proofErr w:type="spellEnd"/>
+            <w:r>
+              <w:rPr>
+                <w:rFonts w:ascii="Calibri" w:eastAsia="Times New Roman" w:hAnsi="Calibri" w:cs="Calibri"/>
+                <w:b/>
+                <w:bCs/>
+                <w:color w:val="000000"/>
+                <w:lang w:val="es-CO" w:eastAsia="es-CO"/>
+              </w:rPr>
+              <w:t xml:space="preserve"> (°C)</w:t>
+            </w:r>
+          </w:p>
+        </w:tc>
+      </w:tr>
+      <w:tr>
+        <w:trPr>
+          <w:trHeight w:val="288"/>
+        </w:trPr>
+        <w:tc>
+          <w:tcPr>
+            <w:tcW w:w="960" w:type="dxa"/>
+            <w:noWrap/>
+            <w:hideMark/>
+          </w:tcPr>
+          <w:p>
+            <w:pPr>
+              <w:rPr>
+                <w:rFonts w:ascii="Calibri" w:eastAsia="Times New Roman" w:hAnsi="Calibri" w:cs="Calibri"/>
+                <w:color w:val="000000"/>
+                <w:lang w:val="es-CO" w:eastAsia="es-CO"/>
+              </w:rPr>
+            </w:pPr>
+            <w:r>
+              <w:rPr>
+                <w:rFonts w:ascii="Calibri" w:eastAsia="Times New Roman" w:hAnsi="Calibri" w:cs="Calibri"/>
+                <w:color w:val="000000"/>
+                <w:lang w:val="es-CO" w:eastAsia="es-CO"/>
+              </w:rPr>
+              <w:t>D3</w:t>
+            </w:r>
+          </w:p>
+        </w:tc>
+        <w:tc>
+          <w:tcPr>
+            <w:tcW w:w="960" w:type="dxa"/>
+            <w:noWrap/>
+            <w:hideMark/>
+          </w:tcPr>
+          <w:p>
+            <w:pPr>
+              <w:jc w:val="right"/>
+              <w:rPr>
+                <w:rFonts w:ascii="Calibri" w:eastAsia="Times New Roman" w:hAnsi="Calibri" w:cs="Calibri"/>
+                <w:color w:val="000000"/>
+                <w:lang w:val="es-CO" w:eastAsia="es-CO"/>
+              </w:rPr>
+            </w:pPr>
+            <w:r>
+              <w:rPr>
+                <w:rFonts w:ascii="Calibri" w:eastAsia="Times New Roman" w:hAnsi="Calibri" w:cs="Calibri"/>
+                <w:color w:val="000000"/>
+                <w:lang w:val="es-CO" w:eastAsia="es-CO"/>
+              </w:rPr>
+              <w:t>0.3</w:t>
+            </w:r>
+          </w:p>
+        </w:tc>
+        <w:tc>
+          <w:tcPr>
+            <w:tcW w:w="1228" w:type="dxa"/>
+            <w:noWrap/>
+            <w:hideMark/>
+          </w:tcPr>
+          <w:p>
+            <w:pPr>
+              <w:jc w:val="right"/>
+              <w:rPr>
+                <w:rFonts w:ascii="Calibri" w:eastAsia="Times New Roman" w:hAnsi="Calibri" w:cs="Calibri"/>
+                <w:color w:val="000000"/>
+                <w:lang w:val="es-CO" w:eastAsia="es-CO"/>
+              </w:rPr>
+            </w:pPr>
+            <w:r>
+              <w:rPr>
+                <w:rFonts w:ascii="Calibri" w:eastAsia="Times New Roman" w:hAnsi="Calibri" w:cs="Calibri"/>
+                <w:color w:val="000000"/>
+                <w:lang w:val="es-CO" w:eastAsia="es-CO"/>
+              </w:rPr>
+              <w:t>-0.056</w:t>
+            </w:r>
+          </w:p>
+        </w:tc>
+      </w:tr>
+      <w:tr>
+        <w:trPr>
+          <w:trHeight w:val="288"/>
+        </w:trPr>
+        <w:tc>
+          <w:tcPr>
+            <w:tcW w:w="960" w:type="dxa"/>
+            <w:noWrap/>
+            <w:hideMark/>
+          </w:tcPr>
+          <w:p>
+            <w:pPr>
+              <w:rPr>
+                <w:rFonts w:ascii="Calibri" w:eastAsia="Times New Roman" w:hAnsi="Calibri" w:cs="Calibri"/>
+                <w:color w:val="000000"/>
+                <w:lang w:val="es-CO" w:eastAsia="es-CO"/>
+              </w:rPr>
+            </w:pPr>
+            <w:r>
+              <w:rPr>
+                <w:rFonts w:ascii="Calibri" w:eastAsia="Times New Roman" w:hAnsi="Calibri" w:cs="Calibri"/>
+                <w:color w:val="000000"/>
+                <w:lang w:val="es-CO" w:eastAsia="es-CO"/>
+              </w:rPr>
+              <w:t>D7</w:t>
+            </w:r>
+          </w:p>
+        </w:tc>
+        <w:tc>
+          <w:tcPr>
+            <w:tcW w:w="960" w:type="dxa"/>
+            <w:noWrap/>
+            <w:hideMark/>
+          </w:tcPr>
+          <w:p>
+            <w:pPr>
+              <w:jc w:val="right"/>
+              <w:rPr>
+                <w:rFonts w:ascii="Calibri" w:eastAsia="Times New Roman" w:hAnsi="Calibri" w:cs="Calibri"/>
+                <w:color w:val="000000"/>
+                <w:lang w:val="es-CO" w:eastAsia="es-CO"/>
+              </w:rPr>
+            </w:pPr>
+            <w:r>
+              <w:rPr>
+                <w:rFonts w:ascii="Calibri" w:eastAsia="Times New Roman" w:hAnsi="Calibri" w:cs="Calibri"/>
+                <w:color w:val="000000"/>
+                <w:lang w:val="es-CO" w:eastAsia="es-CO"/>
+              </w:rPr>
+              <w:t>0.7</w:t>
+            </w:r>
+          </w:p>
+        </w:tc>
+        <w:tc>
+          <w:tcPr>
+            <w:tcW w:w="1228" w:type="dxa"/>
+            <w:noWrap/>
+            <w:hideMark/>
+          </w:tcPr>
+          <w:p>
+            <w:pPr>
+              <w:jc w:val="right"/>
+              <w:rPr>
+                <w:rFonts w:ascii="Calibri" w:eastAsia="Times New Roman" w:hAnsi="Calibri" w:cs="Calibri"/>
+                <w:color w:val="000000"/>
+                <w:lang w:val="es-CO" w:eastAsia="es-CO"/>
+              </w:rPr>
+            </w:pPr>
+            <w:r>
+              <w:rPr>
+                <w:rFonts w:ascii="Calibri" w:eastAsia="Times New Roman" w:hAnsi="Calibri" w:cs="Calibri"/>
+                <w:color w:val="000000"/>
+                <w:lang w:val="es-CO" w:eastAsia="es-CO"/>
+              </w:rPr>
+              <w:t>0.083</w:t>
+            </w:r>
+          </w:p>
+        </w:tc>
+      </w:tr>
+    </w:tbl>
     <w:p>
       <w:pPr>
-        <w:pStyle w:val="Heading3"/>
-        <w:rPr>
-          <w:lang w:val="es-419"/>
-        </w:rPr>
-      </w:pPr>
-      <w:r>
-        <w:rPr>
-          <w:lang w:val="es-419"/>
-        </w:rPr>
-        <w:t>Pregunta 1.2.4</w:t>
-      </w:r>
+        <w:rPr>
+          <w:lang w:val="es-419"/>
+        </w:rPr>
+      </w:pPr>
     </w:p>
     <w:p>
       <w:pPr>
+        <w:pStyle w:val="Heading3"/>
+        <w:rPr>
+          <w:lang w:val="es-419"/>
+        </w:rPr>
+      </w:pPr>
+      <w:r>
+        <w:rPr>
+          <w:lang w:val="es-419"/>
+        </w:rPr>
+        <w:t>Pregunta 1.2.4</w:t>
+      </w:r>
+    </w:p>
+    <w:p>
+      <w:pPr>
         <w:rPr>
           <w:lang w:val="es-419"/>
         </w:rPr>
@@ -1547,6 +3606,262 @@
         </w:rPr>
         <w:t>Usando los valores de la Pregunta 3, cuenta cuántas anomalías se consideran “calientes” en 1981–2010 y exprésalo como porcentaje.</w:t>
       </w:r>
+    </w:p>
+    <w:tbl>
+      <w:tblPr>
+        <w:tblStyle w:val="TableGrid"/>
+        <w:tblW w:w="3928" w:type="dxa"/>
+        <w:tblLook w:val="04A0" w:firstRow="1" w:lastRow="0" w:firstColumn="1" w:lastColumn="0" w:noHBand="0" w:noVBand="1"/>
+      </w:tblPr>
+      <w:tblGrid>
+        <w:gridCol w:w="1911"/>
+        <w:gridCol w:w="965"/>
+        <w:gridCol w:w="1243"/>
+      </w:tblGrid>
+      <w:tr>
+        <w:trPr>
+          <w:trHeight w:val="288"/>
+        </w:trPr>
+        <w:tc>
+          <w:tcPr>
+            <w:tcW w:w="1911" w:type="dxa"/>
+            <w:noWrap/>
+            <w:hideMark/>
+          </w:tcPr>
+          <w:p>
+            <w:pPr>
+              <w:jc w:val="center"/>
+              <w:rPr>
+                <w:rFonts w:ascii="Calibri" w:eastAsia="Times New Roman" w:hAnsi="Calibri" w:cs="Calibri"/>
+                <w:b/>
+                <w:bCs/>
+                <w:color w:val="000000"/>
+                <w:lang w:val="es-CO" w:eastAsia="es-CO"/>
+              </w:rPr>
+            </w:pPr>
+            <w:proofErr w:type="spellStart"/>
+            <w:r>
+              <w:rPr>
+                <w:rFonts w:ascii="Calibri" w:eastAsia="Times New Roman" w:hAnsi="Calibri" w:cs="Calibri"/>
+                <w:b/>
+                <w:bCs/>
+                <w:color w:val="000000"/>
+                <w:lang w:val="es-CO" w:eastAsia="es-CO"/>
+              </w:rPr>
+              <w:t>Category</w:t>
+            </w:r>
+            <w:proofErr w:type="spellEnd"/>
+          </w:p>
+        </w:tc>
+        <w:tc>
+          <w:tcPr>
+            <w:tcW w:w="960" w:type="dxa"/>
+            <w:noWrap/>
+            <w:hideMark/>
+          </w:tcPr>
+          <w:p>
+            <w:pPr>
+              <w:jc w:val="center"/>
+              <w:rPr>
+                <w:rFonts w:ascii="Calibri" w:eastAsia="Times New Roman" w:hAnsi="Calibri" w:cs="Calibri"/>
+                <w:b/>
+                <w:bCs/>
+                <w:color w:val="000000"/>
+                <w:lang w:val="es-CO" w:eastAsia="es-CO"/>
+              </w:rPr>
+            </w:pPr>
+            <w:r>
+              <w:rPr>
+                <w:rFonts w:ascii="Calibri" w:eastAsia="Times New Roman" w:hAnsi="Calibri" w:cs="Calibri"/>
+                <w:b/>
+                <w:bCs/>
+                <w:color w:val="000000"/>
+                <w:lang w:val="es-CO" w:eastAsia="es-CO"/>
+              </w:rPr>
+              <w:t xml:space="preserve">Number </w:t>
+            </w:r>
+            <w:proofErr w:type="spellStart"/>
+            <w:r>
+              <w:rPr>
+                <w:rFonts w:ascii="Calibri" w:eastAsia="Times New Roman" w:hAnsi="Calibri" w:cs="Calibri"/>
+                <w:b/>
+                <w:bCs/>
+                <w:color w:val="000000"/>
+                <w:lang w:val="es-CO" w:eastAsia="es-CO"/>
+              </w:rPr>
+              <w:t>of</w:t>
+            </w:r>
+            <w:proofErr w:type="spellEnd"/>
+            <w:r>
+              <w:rPr>
+                <w:rFonts w:ascii="Calibri" w:eastAsia="Times New Roman" w:hAnsi="Calibri" w:cs="Calibri"/>
+                <w:b/>
+                <w:bCs/>
+                <w:color w:val="000000"/>
+                <w:lang w:val="es-CO" w:eastAsia="es-CO"/>
+              </w:rPr>
+              <w:t xml:space="preserve"> </w:t>
+            </w:r>
+            <w:proofErr w:type="spellStart"/>
+            <w:r>
+              <w:rPr>
+                <w:rFonts w:ascii="Calibri" w:eastAsia="Times New Roman" w:hAnsi="Calibri" w:cs="Calibri"/>
+                <w:b/>
+                <w:bCs/>
+                <w:color w:val="000000"/>
+                <w:lang w:val="es-CO" w:eastAsia="es-CO"/>
+              </w:rPr>
+              <w:t>years</w:t>
+            </w:r>
+            <w:proofErr w:type="spellEnd"/>
+          </w:p>
+        </w:tc>
+        <w:tc>
+          <w:tcPr>
+            <w:tcW w:w="1057" w:type="dxa"/>
+            <w:noWrap/>
+            <w:hideMark/>
+          </w:tcPr>
+          <w:p>
+            <w:pPr>
+              <w:jc w:val="center"/>
+              <w:rPr>
+                <w:rFonts w:ascii="Calibri" w:eastAsia="Times New Roman" w:hAnsi="Calibri" w:cs="Calibri"/>
+                <w:b/>
+                <w:bCs/>
+                <w:color w:val="000000"/>
+                <w:lang w:val="es-CO" w:eastAsia="es-CO"/>
+              </w:rPr>
+            </w:pPr>
+            <w:proofErr w:type="spellStart"/>
+            <w:r>
+              <w:rPr>
+                <w:rFonts w:ascii="Calibri" w:eastAsia="Times New Roman" w:hAnsi="Calibri" w:cs="Calibri"/>
+                <w:b/>
+                <w:bCs/>
+                <w:color w:val="000000"/>
+                <w:lang w:val="es-CO" w:eastAsia="es-CO"/>
+              </w:rPr>
+              <w:t>Percentage</w:t>
+            </w:r>
+            <w:proofErr w:type="spellEnd"/>
+            <w:r>
+              <w:rPr>
+                <w:rFonts w:ascii="Calibri" w:eastAsia="Times New Roman" w:hAnsi="Calibri" w:cs="Calibri"/>
+                <w:b/>
+                <w:bCs/>
+                <w:color w:val="000000"/>
+                <w:lang w:val="es-CO" w:eastAsia="es-CO"/>
+              </w:rPr>
+              <w:t xml:space="preserve"> (%)</w:t>
+            </w:r>
+          </w:p>
+        </w:tc>
+      </w:tr>
+      <w:tr>
+        <w:trPr>
+          <w:trHeight w:val="288"/>
+        </w:trPr>
+        <w:tc>
+          <w:tcPr>
+            <w:tcW w:w="1911" w:type="dxa"/>
+            <w:noWrap/>
+            <w:hideMark/>
+          </w:tcPr>
+          <w:p>
+            <w:pPr>
+              <w:rPr>
+                <w:rFonts w:ascii="Calibri" w:eastAsia="Times New Roman" w:hAnsi="Calibri" w:cs="Calibri"/>
+                <w:color w:val="000000"/>
+                <w:lang w:val="es-CO" w:eastAsia="es-CO"/>
+              </w:rPr>
+            </w:pPr>
+            <w:r>
+              <w:rPr>
+                <w:rFonts w:ascii="Calibri" w:eastAsia="Times New Roman" w:hAnsi="Calibri" w:cs="Calibri"/>
+                <w:color w:val="000000"/>
+                <w:lang w:val="es-CO" w:eastAsia="es-CO"/>
+              </w:rPr>
+              <w:t xml:space="preserve">Hot </w:t>
+            </w:r>
+            <w:proofErr w:type="spellStart"/>
+            <w:r>
+              <w:rPr>
+                <w:rFonts w:ascii="Calibri" w:eastAsia="Times New Roman" w:hAnsi="Calibri" w:cs="Calibri"/>
+                <w:color w:val="000000"/>
+                <w:lang w:val="es-CO" w:eastAsia="es-CO"/>
+              </w:rPr>
+              <w:t>anomalies</w:t>
+            </w:r>
+            <w:proofErr w:type="spellEnd"/>
+            <w:r>
+              <w:rPr>
+                <w:rFonts w:ascii="Calibri" w:eastAsia="Times New Roman" w:hAnsi="Calibri" w:cs="Calibri"/>
+                <w:color w:val="000000"/>
+                <w:lang w:val="es-CO" w:eastAsia="es-CO"/>
+              </w:rPr>
+              <w:t xml:space="preserve"> (&gt; D7)</w:t>
+            </w:r>
+          </w:p>
+        </w:tc>
+        <w:tc>
+          <w:tcPr>
+            <w:tcW w:w="960" w:type="dxa"/>
+            <w:noWrap/>
+            <w:hideMark/>
+          </w:tcPr>
+          <w:p>
+            <w:pPr>
+              <w:jc w:val="right"/>
+              <w:rPr>
+                <w:rFonts w:ascii="Calibri" w:eastAsia="Times New Roman" w:hAnsi="Calibri" w:cs="Calibri"/>
+                <w:color w:val="000000"/>
+                <w:lang w:val="es-CO" w:eastAsia="es-CO"/>
+              </w:rPr>
+            </w:pPr>
+            <w:r>
+              <w:rPr>
+                <w:rFonts w:ascii="Calibri" w:eastAsia="Times New Roman" w:hAnsi="Calibri" w:cs="Calibri"/>
+                <w:color w:val="000000"/>
+                <w:lang w:val="es-CO" w:eastAsia="es-CO"/>
+              </w:rPr>
+              <w:t>27</w:t>
+            </w:r>
+          </w:p>
+        </w:tc>
+        <w:tc>
+          <w:tcPr>
+            <w:tcW w:w="1057" w:type="dxa"/>
+            <w:noWrap/>
+            <w:hideMark/>
+          </w:tcPr>
+          <w:p>
+            <w:pPr>
+              <w:jc w:val="right"/>
+              <w:rPr>
+                <w:rFonts w:ascii="Calibri" w:eastAsia="Times New Roman" w:hAnsi="Calibri" w:cs="Calibri"/>
+                <w:color w:val="000000"/>
+                <w:lang w:val="es-CO" w:eastAsia="es-CO"/>
+              </w:rPr>
+            </w:pPr>
+            <w:r>
+              <w:rPr>
+                <w:rFonts w:ascii="Calibri" w:eastAsia="Times New Roman" w:hAnsi="Calibri" w:cs="Calibri"/>
+                <w:color w:val="000000"/>
+                <w:lang w:val="es-CO" w:eastAsia="es-CO"/>
+              </w:rPr>
+              <w:t>90</w:t>
+            </w:r>
+          </w:p>
+        </w:tc>
+      </w:tr>
+    </w:tbl>
+    <w:p>
+      <w:pPr>
+        <w:rPr>
+          <w:lang w:val="es-419"/>
+        </w:rPr>
+      </w:pPr>
       <w:r>
         <w:rPr>
           <w:lang w:val="es-419"/>
@@ -1557,20 +3872,63 @@
     </w:p>
     <w:p>
       <w:pPr>
-        <w:pStyle w:val="Heading3"/>
-        <w:rPr>
-          <w:lang w:val="es-419"/>
-        </w:rPr>
-      </w:pPr>
-      <w:r>
-        <w:rPr>
-          <w:lang w:val="es-419"/>
-        </w:rPr>
-        <w:t>Pregunta 1.2.5</w:t>
+        <w:rPr>
+          <w:lang w:val="es-419"/>
+        </w:rPr>
+      </w:pPr>
+      <w:r>
+        <w:rPr>
+          <w:highlight w:val="yellow"/>
+          <w:lang w:val="es-419"/>
+        </w:rPr>
+        <w:t xml:space="preserve">Este recuento que hacemos según el tercio superior, donde </w:t>
+      </w:r>
+      <w:proofErr w:type="gramStart"/>
+      <w:r>
+        <w:rPr>
+          <w:highlight w:val="yellow"/>
+          <w:lang w:val="es-419"/>
+        </w:rPr>
+        <w:t>este representan</w:t>
+      </w:r>
+      <w:proofErr w:type="gramEnd"/>
+      <w:r>
+        <w:rPr>
+          <w:highlight w:val="yellow"/>
+          <w:lang w:val="es-419"/>
+        </w:rPr>
+        <w:t xml:space="preserve"> el 90% de las anomalías registradas, demuestra que en </w:t>
+      </w:r>
+      <w:r>
+        <w:rPr>
+          <w:highlight w:val="yellow"/>
+          <w:lang w:val="es-419"/>
+        </w:rPr>
+        <w:t>su gran mayoría el periodo de 1981-2010 fue un periodo de temperaturas calientes.</w:t>
+      </w:r>
+      <w:r>
+        <w:rPr>
+          <w:lang w:val="es-419"/>
+        </w:rPr>
+        <w:t xml:space="preserve"> </w:t>
       </w:r>
     </w:p>
     <w:p>
       <w:pPr>
+        <w:pStyle w:val="Heading3"/>
+        <w:rPr>
+          <w:lang w:val="es-419"/>
+        </w:rPr>
+      </w:pPr>
+      <w:r>
+        <w:rPr>
+          <w:lang w:val="es-419"/>
+        </w:rPr>
+        <w:t>Pregunta 1.2.5</w:t>
+      </w:r>
+    </w:p>
+    <w:p>
+      <w:pPr>
         <w:rPr>
           <w:lang w:val="es-419"/>
         </w:rPr>
@@ -1588,6 +3946,997 @@
         <w:br/>
         <w:t>- Calcula la media y varianza de las temperaturas en cada estación (DJF, MAM, JJA, SON) para 1921–1950, 1951–1980 y 1981–2010.</w:t>
       </w:r>
+    </w:p>
+    <w:tbl>
+      <w:tblPr>
+        <w:tblStyle w:val="TableGrid"/>
+        <w:tblW w:w="9031" w:type="dxa"/>
+        <w:tblLook w:val="04A0" w:firstRow="1" w:lastRow="0" w:firstColumn="1" w:lastColumn="0" w:noHBand="0" w:noVBand="1"/>
+      </w:tblPr>
+      <w:tblGrid>
+        <w:gridCol w:w="1258"/>
+        <w:gridCol w:w="1258"/>
+        <w:gridCol w:w="1333"/>
+        <w:gridCol w:w="1258"/>
+        <w:gridCol w:w="1333"/>
+        <w:gridCol w:w="1258"/>
+        <w:gridCol w:w="1333"/>
+      </w:tblGrid>
+      <w:tr>
+        <w:trPr>
+          <w:trHeight w:val="288"/>
+        </w:trPr>
+        <w:tc>
+          <w:tcPr>
+            <w:tcW w:w="1258" w:type="dxa"/>
+            <w:noWrap/>
+            <w:hideMark/>
+          </w:tcPr>
+          <w:p>
+            <w:pPr>
+              <w:rPr>
+                <w:rFonts w:ascii="Times New Roman" w:eastAsia="Times New Roman" w:hAnsi="Times New Roman" w:cs="Times New Roman"/>
+                <w:sz w:val="24"/>
+                <w:szCs w:val="24"/>
+                <w:lang w:val="es-CO" w:eastAsia="es-CO"/>
+              </w:rPr>
+            </w:pPr>
+          </w:p>
+        </w:tc>
+        <w:tc>
+          <w:tcPr>
+            <w:tcW w:w="1258" w:type="dxa"/>
+            <w:noWrap/>
+            <w:hideMark/>
+          </w:tcPr>
+          <w:p>
+            <w:pPr>
+              <w:jc w:val="center"/>
+              <w:rPr>
+                <w:rFonts w:ascii="Calibri" w:eastAsia="Times New Roman" w:hAnsi="Calibri" w:cs="Calibri"/>
+                <w:b/>
+                <w:bCs/>
+                <w:color w:val="000000"/>
+                <w:lang w:val="es-CO" w:eastAsia="es-CO"/>
+              </w:rPr>
+            </w:pPr>
+            <w:r>
+              <w:rPr>
+                <w:rFonts w:ascii="Calibri" w:eastAsia="Times New Roman" w:hAnsi="Calibri" w:cs="Calibri"/>
+                <w:b/>
+                <w:bCs/>
+                <w:color w:val="000000"/>
+                <w:lang w:val="es-CO" w:eastAsia="es-CO"/>
+              </w:rPr>
+              <w:t>Mean 1921–1950</w:t>
+            </w:r>
+          </w:p>
+        </w:tc>
+        <w:tc>
+          <w:tcPr>
+            <w:tcW w:w="1333" w:type="dxa"/>
+            <w:noWrap/>
+            <w:hideMark/>
+          </w:tcPr>
+          <w:p>
+            <w:pPr>
+              <w:jc w:val="center"/>
+              <w:rPr>
+                <w:rFonts w:ascii="Calibri" w:eastAsia="Times New Roman" w:hAnsi="Calibri" w:cs="Calibri"/>
+                <w:b/>
+                <w:bCs/>
+                <w:color w:val="000000"/>
+                <w:lang w:val="es-CO" w:eastAsia="es-CO"/>
+              </w:rPr>
+            </w:pPr>
+            <w:proofErr w:type="spellStart"/>
+            <w:r>
+              <w:rPr>
+                <w:rFonts w:ascii="Calibri" w:eastAsia="Times New Roman" w:hAnsi="Calibri" w:cs="Calibri"/>
+                <w:b/>
+                <w:bCs/>
+                <w:color w:val="000000"/>
+                <w:lang w:val="es-CO" w:eastAsia="es-CO"/>
+              </w:rPr>
+              <w:t>Variance</w:t>
+            </w:r>
+            <w:proofErr w:type="spellEnd"/>
+            <w:r>
+              <w:rPr>
+                <w:rFonts w:ascii="Calibri" w:eastAsia="Times New Roman" w:hAnsi="Calibri" w:cs="Calibri"/>
+                <w:b/>
+                <w:bCs/>
+                <w:color w:val="000000"/>
+                <w:lang w:val="es-CO" w:eastAsia="es-CO"/>
+              </w:rPr>
+              <w:t xml:space="preserve"> 1921–1950</w:t>
+            </w:r>
+          </w:p>
+        </w:tc>
+        <w:tc>
+          <w:tcPr>
+            <w:tcW w:w="1258" w:type="dxa"/>
+            <w:noWrap/>
+            <w:hideMark/>
+          </w:tcPr>
+          <w:p>
+            <w:pPr>
+              <w:jc w:val="center"/>
+              <w:rPr>
+                <w:rFonts w:ascii="Calibri" w:eastAsia="Times New Roman" w:hAnsi="Calibri" w:cs="Calibri"/>
+                <w:b/>
+                <w:bCs/>
+                <w:color w:val="000000"/>
+                <w:lang w:val="es-CO" w:eastAsia="es-CO"/>
+              </w:rPr>
+            </w:pPr>
+            <w:r>
+              <w:rPr>
+                <w:rFonts w:ascii="Calibri" w:eastAsia="Times New Roman" w:hAnsi="Calibri" w:cs="Calibri"/>
+                <w:b/>
+                <w:bCs/>
+                <w:color w:val="000000"/>
+                <w:lang w:val="es-CO" w:eastAsia="es-CO"/>
+              </w:rPr>
+              <w:t>Mean 1951–1980</w:t>
+            </w:r>
+          </w:p>
+        </w:tc>
+        <w:tc>
+          <w:tcPr>
+            <w:tcW w:w="1333" w:type="dxa"/>
+            <w:noWrap/>
+            <w:hideMark/>
+          </w:tcPr>
+          <w:p>
+            <w:pPr>
+              <w:jc w:val="center"/>
+              <w:rPr>
+                <w:rFonts w:ascii="Calibri" w:eastAsia="Times New Roman" w:hAnsi="Calibri" w:cs="Calibri"/>
+                <w:b/>
+                <w:bCs/>
+                <w:color w:val="000000"/>
+                <w:lang w:val="es-CO" w:eastAsia="es-CO"/>
+              </w:rPr>
+            </w:pPr>
+            <w:proofErr w:type="spellStart"/>
+            <w:r>
+              <w:rPr>
+                <w:rFonts w:ascii="Calibri" w:eastAsia="Times New Roman" w:hAnsi="Calibri" w:cs="Calibri"/>
+                <w:b/>
+                <w:bCs/>
+                <w:color w:val="000000"/>
+                <w:lang w:val="es-CO" w:eastAsia="es-CO"/>
+              </w:rPr>
+              <w:t>Variance</w:t>
+            </w:r>
+            <w:proofErr w:type="spellEnd"/>
+            <w:r>
+              <w:rPr>
+                <w:rFonts w:ascii="Calibri" w:eastAsia="Times New Roman" w:hAnsi="Calibri" w:cs="Calibri"/>
+                <w:b/>
+                <w:bCs/>
+                <w:color w:val="000000"/>
+                <w:lang w:val="es-CO" w:eastAsia="es-CO"/>
+              </w:rPr>
+              <w:t xml:space="preserve"> 1951–1980</w:t>
+            </w:r>
+          </w:p>
+        </w:tc>
+        <w:tc>
+          <w:tcPr>
+            <w:tcW w:w="1258" w:type="dxa"/>
+            <w:noWrap/>
+            <w:hideMark/>
+          </w:tcPr>
+          <w:p>
+            <w:pPr>
+              <w:jc w:val="center"/>
+              <w:rPr>
+                <w:rFonts w:ascii="Calibri" w:eastAsia="Times New Roman" w:hAnsi="Calibri" w:cs="Calibri"/>
+                <w:b/>
+                <w:bCs/>
+                <w:color w:val="000000"/>
+                <w:lang w:val="es-CO" w:eastAsia="es-CO"/>
+              </w:rPr>
+            </w:pPr>
+            <w:r>
+              <w:rPr>
+                <w:rFonts w:ascii="Calibri" w:eastAsia="Times New Roman" w:hAnsi="Calibri" w:cs="Calibri"/>
+                <w:b/>
+                <w:bCs/>
+                <w:color w:val="000000"/>
+                <w:lang w:val="es-CO" w:eastAsia="es-CO"/>
+              </w:rPr>
+              <w:t>Mean 1981–2010</w:t>
+            </w:r>
+          </w:p>
+        </w:tc>
+        <w:tc>
+          <w:tcPr>
+            <w:tcW w:w="1333" w:type="dxa"/>
+            <w:noWrap/>
+            <w:hideMark/>
+          </w:tcPr>
+          <w:p>
+            <w:pPr>
+              <w:jc w:val="center"/>
+              <w:rPr>
+                <w:rFonts w:ascii="Calibri" w:eastAsia="Times New Roman" w:hAnsi="Calibri" w:cs="Calibri"/>
+                <w:b/>
+                <w:bCs/>
+                <w:color w:val="000000"/>
+                <w:lang w:val="es-CO" w:eastAsia="es-CO"/>
+              </w:rPr>
+            </w:pPr>
+            <w:proofErr w:type="spellStart"/>
+            <w:r>
+              <w:rPr>
+                <w:rFonts w:ascii="Calibri" w:eastAsia="Times New Roman" w:hAnsi="Calibri" w:cs="Calibri"/>
+                <w:b/>
+                <w:bCs/>
+                <w:color w:val="000000"/>
+                <w:lang w:val="es-CO" w:eastAsia="es-CO"/>
+              </w:rPr>
+              <w:t>Variance</w:t>
+            </w:r>
+            <w:proofErr w:type="spellEnd"/>
+            <w:r>
+              <w:rPr>
+                <w:rFonts w:ascii="Calibri" w:eastAsia="Times New Roman" w:hAnsi="Calibri" w:cs="Calibri"/>
+                <w:b/>
+                <w:bCs/>
+                <w:color w:val="000000"/>
+                <w:lang w:val="es-CO" w:eastAsia="es-CO"/>
+              </w:rPr>
+              <w:t xml:space="preserve"> 1981–2010</w:t>
+            </w:r>
+          </w:p>
+        </w:tc>
+      </w:tr>
+      <w:tr>
+        <w:trPr>
+          <w:trHeight w:val="288"/>
+        </w:trPr>
+        <w:tc>
+          <w:tcPr>
+            <w:tcW w:w="1258" w:type="dxa"/>
+            <w:noWrap/>
+            <w:hideMark/>
+          </w:tcPr>
+          <w:p>
+            <w:pPr>
+              <w:jc w:val="center"/>
+              <w:rPr>
+                <w:rFonts w:ascii="Calibri" w:eastAsia="Times New Roman" w:hAnsi="Calibri" w:cs="Calibri"/>
+                <w:b/>
+                <w:bCs/>
+                <w:color w:val="000000"/>
+                <w:lang w:val="es-CO" w:eastAsia="es-CO"/>
+              </w:rPr>
+            </w:pPr>
+            <w:r>
+              <w:rPr>
+                <w:rFonts w:ascii="Calibri" w:eastAsia="Times New Roman" w:hAnsi="Calibri" w:cs="Calibri"/>
+                <w:b/>
+                <w:bCs/>
+                <w:color w:val="000000"/>
+                <w:lang w:val="es-CO" w:eastAsia="es-CO"/>
+              </w:rPr>
+              <w:t>DJF</w:t>
+            </w:r>
+          </w:p>
+        </w:tc>
+        <w:tc>
+          <w:tcPr>
+            <w:tcW w:w="1258" w:type="dxa"/>
+            <w:noWrap/>
+            <w:hideMark/>
+          </w:tcPr>
+          <w:p>
+            <w:pPr>
+              <w:jc w:val="right"/>
+              <w:rPr>
+                <w:rFonts w:ascii="Calibri" w:eastAsia="Times New Roman" w:hAnsi="Calibri" w:cs="Calibri"/>
+                <w:color w:val="000000"/>
+                <w:lang w:val="es-CO" w:eastAsia="es-CO"/>
+              </w:rPr>
+            </w:pPr>
+            <w:r>
+              <w:rPr>
+                <w:rFonts w:ascii="Calibri" w:eastAsia="Times New Roman" w:hAnsi="Calibri" w:cs="Calibri"/>
+                <w:color w:val="000000"/>
+                <w:lang w:val="es-CO" w:eastAsia="es-CO"/>
+              </w:rPr>
+              <w:t>-0.044</w:t>
+            </w:r>
+          </w:p>
+        </w:tc>
+        <w:tc>
+          <w:tcPr>
+            <w:tcW w:w="1333" w:type="dxa"/>
+            <w:noWrap/>
+            <w:hideMark/>
+          </w:tcPr>
+          <w:p>
+            <w:pPr>
+              <w:jc w:val="right"/>
+              <w:rPr>
+                <w:rFonts w:ascii="Calibri" w:eastAsia="Times New Roman" w:hAnsi="Calibri" w:cs="Calibri"/>
+                <w:color w:val="000000"/>
+                <w:lang w:val="es-CO" w:eastAsia="es-CO"/>
+              </w:rPr>
+            </w:pPr>
+            <w:r>
+              <w:rPr>
+                <w:rFonts w:ascii="Calibri" w:eastAsia="Times New Roman" w:hAnsi="Calibri" w:cs="Calibri"/>
+                <w:color w:val="000000"/>
+                <w:lang w:val="es-CO" w:eastAsia="es-CO"/>
+              </w:rPr>
+              <w:t>0.057</w:t>
+            </w:r>
+          </w:p>
+        </w:tc>
+        <w:tc>
+          <w:tcPr>
+            <w:tcW w:w="1258" w:type="dxa"/>
+            <w:noWrap/>
+            <w:hideMark/>
+          </w:tcPr>
+          <w:p>
+            <w:pPr>
+              <w:jc w:val="right"/>
+              <w:rPr>
+                <w:rFonts w:ascii="Calibri" w:eastAsia="Times New Roman" w:hAnsi="Calibri" w:cs="Calibri"/>
+                <w:color w:val="000000"/>
+                <w:lang w:val="es-CO" w:eastAsia="es-CO"/>
+              </w:rPr>
+            </w:pPr>
+            <w:r>
+              <w:rPr>
+                <w:rFonts w:ascii="Calibri" w:eastAsia="Times New Roman" w:hAnsi="Calibri" w:cs="Calibri"/>
+                <w:color w:val="000000"/>
+                <w:lang w:val="es-CO" w:eastAsia="es-CO"/>
+              </w:rPr>
+              <w:t>-0.003</w:t>
+            </w:r>
+          </w:p>
+        </w:tc>
+        <w:tc>
+          <w:tcPr>
+            <w:tcW w:w="1333" w:type="dxa"/>
+            <w:noWrap/>
+            <w:hideMark/>
+          </w:tcPr>
+          <w:p>
+            <w:pPr>
+              <w:jc w:val="right"/>
+              <w:rPr>
+                <w:rFonts w:ascii="Calibri" w:eastAsia="Times New Roman" w:hAnsi="Calibri" w:cs="Calibri"/>
+                <w:color w:val="000000"/>
+                <w:lang w:val="es-CO" w:eastAsia="es-CO"/>
+              </w:rPr>
+            </w:pPr>
+            <w:r>
+              <w:rPr>
+                <w:rFonts w:ascii="Calibri" w:eastAsia="Times New Roman" w:hAnsi="Calibri" w:cs="Calibri"/>
+                <w:color w:val="000000"/>
+                <w:lang w:val="es-CO" w:eastAsia="es-CO"/>
+              </w:rPr>
+              <w:t>0.051</w:t>
+            </w:r>
+          </w:p>
+        </w:tc>
+        <w:tc>
+          <w:tcPr>
+            <w:tcW w:w="1258" w:type="dxa"/>
+            <w:noWrap/>
+            <w:hideMark/>
+          </w:tcPr>
+          <w:p>
+            <w:pPr>
+              <w:jc w:val="right"/>
+              <w:rPr>
+                <w:rFonts w:ascii="Calibri" w:eastAsia="Times New Roman" w:hAnsi="Calibri" w:cs="Calibri"/>
+                <w:color w:val="000000"/>
+                <w:lang w:val="es-CO" w:eastAsia="es-CO"/>
+              </w:rPr>
+            </w:pPr>
+            <w:r>
+              <w:rPr>
+                <w:rFonts w:ascii="Calibri" w:eastAsia="Times New Roman" w:hAnsi="Calibri" w:cs="Calibri"/>
+                <w:color w:val="000000"/>
+                <w:lang w:val="es-CO" w:eastAsia="es-CO"/>
+              </w:rPr>
+              <w:t>0.524</w:t>
+            </w:r>
+          </w:p>
+        </w:tc>
+        <w:tc>
+          <w:tcPr>
+            <w:tcW w:w="1333" w:type="dxa"/>
+            <w:noWrap/>
+            <w:hideMark/>
+          </w:tcPr>
+          <w:p>
+            <w:pPr>
+              <w:jc w:val="right"/>
+              <w:rPr>
+                <w:rFonts w:ascii="Calibri" w:eastAsia="Times New Roman" w:hAnsi="Calibri" w:cs="Calibri"/>
+                <w:color w:val="000000"/>
+                <w:lang w:val="es-CO" w:eastAsia="es-CO"/>
+              </w:rPr>
+            </w:pPr>
+            <w:r>
+              <w:rPr>
+                <w:rFonts w:ascii="Calibri" w:eastAsia="Times New Roman" w:hAnsi="Calibri" w:cs="Calibri"/>
+                <w:color w:val="000000"/>
+                <w:lang w:val="es-CO" w:eastAsia="es-CO"/>
+              </w:rPr>
+              <w:t>0.08</w:t>
+            </w:r>
+          </w:p>
+        </w:tc>
+      </w:tr>
+      <w:tr>
+        <w:trPr>
+          <w:trHeight w:val="288"/>
+        </w:trPr>
+        <w:tc>
+          <w:tcPr>
+            <w:tcW w:w="1258" w:type="dxa"/>
+            <w:noWrap/>
+            <w:hideMark/>
+          </w:tcPr>
+          <w:p>
+            <w:pPr>
+              <w:jc w:val="center"/>
+              <w:rPr>
+                <w:rFonts w:ascii="Calibri" w:eastAsia="Times New Roman" w:hAnsi="Calibri" w:cs="Calibri"/>
+                <w:b/>
+                <w:bCs/>
+                <w:color w:val="000000"/>
+                <w:lang w:val="es-CO" w:eastAsia="es-CO"/>
+              </w:rPr>
+            </w:pPr>
+            <w:r>
+              <w:rPr>
+                <w:rFonts w:ascii="Calibri" w:eastAsia="Times New Roman" w:hAnsi="Calibri" w:cs="Calibri"/>
+                <w:b/>
+                <w:bCs/>
+                <w:color w:val="000000"/>
+                <w:lang w:val="es-CO" w:eastAsia="es-CO"/>
+              </w:rPr>
+              <w:t>MAM</w:t>
+            </w:r>
+          </w:p>
+        </w:tc>
+        <w:tc>
+          <w:tcPr>
+            <w:tcW w:w="1258" w:type="dxa"/>
+            <w:noWrap/>
+            <w:hideMark/>
+          </w:tcPr>
+          <w:p>
+            <w:pPr>
+              <w:jc w:val="right"/>
+              <w:rPr>
+                <w:rFonts w:ascii="Calibri" w:eastAsia="Times New Roman" w:hAnsi="Calibri" w:cs="Calibri"/>
+                <w:color w:val="000000"/>
+                <w:lang w:val="es-CO" w:eastAsia="es-CO"/>
+              </w:rPr>
+            </w:pPr>
+            <w:r>
+              <w:rPr>
+                <w:rFonts w:ascii="Calibri" w:eastAsia="Times New Roman" w:hAnsi="Calibri" w:cs="Calibri"/>
+                <w:color w:val="000000"/>
+                <w:lang w:val="es-CO" w:eastAsia="es-CO"/>
+              </w:rPr>
+              <w:t>-0.058</w:t>
+            </w:r>
+          </w:p>
+        </w:tc>
+        <w:tc>
+          <w:tcPr>
+            <w:tcW w:w="1333" w:type="dxa"/>
+            <w:noWrap/>
+            <w:hideMark/>
+          </w:tcPr>
+          <w:p>
+            <w:pPr>
+              <w:jc w:val="right"/>
+              <w:rPr>
+                <w:rFonts w:ascii="Calibri" w:eastAsia="Times New Roman" w:hAnsi="Calibri" w:cs="Calibri"/>
+                <w:color w:val="000000"/>
+                <w:lang w:val="es-CO" w:eastAsia="es-CO"/>
+              </w:rPr>
+            </w:pPr>
+            <w:r>
+              <w:rPr>
+                <w:rFonts w:ascii="Calibri" w:eastAsia="Times New Roman" w:hAnsi="Calibri" w:cs="Calibri"/>
+                <w:color w:val="000000"/>
+                <w:lang w:val="es-CO" w:eastAsia="es-CO"/>
+              </w:rPr>
+              <w:t>0.032</w:t>
+            </w:r>
+          </w:p>
+        </w:tc>
+        <w:tc>
+          <w:tcPr>
+            <w:tcW w:w="1258" w:type="dxa"/>
+            <w:noWrap/>
+            <w:hideMark/>
+          </w:tcPr>
+          <w:p>
+            <w:pPr>
+              <w:jc w:val="right"/>
+              <w:rPr>
+                <w:rFonts w:ascii="Calibri" w:eastAsia="Times New Roman" w:hAnsi="Calibri" w:cs="Calibri"/>
+                <w:color w:val="000000"/>
+                <w:lang w:val="es-CO" w:eastAsia="es-CO"/>
+              </w:rPr>
+            </w:pPr>
+            <w:r>
+              <w:rPr>
+                <w:rFonts w:ascii="Calibri" w:eastAsia="Times New Roman" w:hAnsi="Calibri" w:cs="Calibri"/>
+                <w:color w:val="000000"/>
+                <w:lang w:val="es-CO" w:eastAsia="es-CO"/>
+              </w:rPr>
+              <w:t>0</w:t>
+            </w:r>
+          </w:p>
+        </w:tc>
+        <w:tc>
+          <w:tcPr>
+            <w:tcW w:w="1333" w:type="dxa"/>
+            <w:noWrap/>
+            <w:hideMark/>
+          </w:tcPr>
+          <w:p>
+            <w:pPr>
+              <w:jc w:val="right"/>
+              <w:rPr>
+                <w:rFonts w:ascii="Calibri" w:eastAsia="Times New Roman" w:hAnsi="Calibri" w:cs="Calibri"/>
+                <w:color w:val="000000"/>
+                <w:lang w:val="es-CO" w:eastAsia="es-CO"/>
+              </w:rPr>
+            </w:pPr>
+            <w:r>
+              <w:rPr>
+                <w:rFonts w:ascii="Calibri" w:eastAsia="Times New Roman" w:hAnsi="Calibri" w:cs="Calibri"/>
+                <w:color w:val="000000"/>
+                <w:lang w:val="es-CO" w:eastAsia="es-CO"/>
+              </w:rPr>
+              <w:t>0.025</w:t>
+            </w:r>
+          </w:p>
+        </w:tc>
+        <w:tc>
+          <w:tcPr>
+            <w:tcW w:w="1258" w:type="dxa"/>
+            <w:noWrap/>
+            <w:hideMark/>
+          </w:tcPr>
+          <w:p>
+            <w:pPr>
+              <w:jc w:val="right"/>
+              <w:rPr>
+                <w:rFonts w:ascii="Calibri" w:eastAsia="Times New Roman" w:hAnsi="Calibri" w:cs="Calibri"/>
+                <w:color w:val="000000"/>
+                <w:lang w:val="es-CO" w:eastAsia="es-CO"/>
+              </w:rPr>
+            </w:pPr>
+            <w:r>
+              <w:rPr>
+                <w:rFonts w:ascii="Calibri" w:eastAsia="Times New Roman" w:hAnsi="Calibri" w:cs="Calibri"/>
+                <w:color w:val="000000"/>
+                <w:lang w:val="es-CO" w:eastAsia="es-CO"/>
+              </w:rPr>
+              <w:t>0.509</w:t>
+            </w:r>
+          </w:p>
+        </w:tc>
+        <w:tc>
+          <w:tcPr>
+            <w:tcW w:w="1333" w:type="dxa"/>
+            <w:noWrap/>
+            <w:hideMark/>
+          </w:tcPr>
+          <w:p>
+            <w:pPr>
+              <w:jc w:val="right"/>
+              <w:rPr>
+                <w:rFonts w:ascii="Calibri" w:eastAsia="Times New Roman" w:hAnsi="Calibri" w:cs="Calibri"/>
+                <w:color w:val="000000"/>
+                <w:lang w:val="es-CO" w:eastAsia="es-CO"/>
+              </w:rPr>
+            </w:pPr>
+            <w:r>
+              <w:rPr>
+                <w:rFonts w:ascii="Calibri" w:eastAsia="Times New Roman" w:hAnsi="Calibri" w:cs="Calibri"/>
+                <w:color w:val="000000"/>
+                <w:lang w:val="es-CO" w:eastAsia="es-CO"/>
+              </w:rPr>
+              <w:t>0.076</w:t>
+            </w:r>
+          </w:p>
+        </w:tc>
+      </w:tr>
+      <w:tr>
+        <w:trPr>
+          <w:trHeight w:val="288"/>
+        </w:trPr>
+        <w:tc>
+          <w:tcPr>
+            <w:tcW w:w="1258" w:type="dxa"/>
+            <w:noWrap/>
+            <w:hideMark/>
+          </w:tcPr>
+          <w:p>
+            <w:pPr>
+              <w:jc w:val="center"/>
+              <w:rPr>
+                <w:rFonts w:ascii="Calibri" w:eastAsia="Times New Roman" w:hAnsi="Calibri" w:cs="Calibri"/>
+                <w:b/>
+                <w:bCs/>
+                <w:color w:val="000000"/>
+                <w:lang w:val="es-CO" w:eastAsia="es-CO"/>
+              </w:rPr>
+            </w:pPr>
+            <w:r>
+              <w:rPr>
+                <w:rFonts w:ascii="Calibri" w:eastAsia="Times New Roman" w:hAnsi="Calibri" w:cs="Calibri"/>
+                <w:b/>
+                <w:bCs/>
+                <w:color w:val="000000"/>
+                <w:lang w:val="es-CO" w:eastAsia="es-CO"/>
+              </w:rPr>
+              <w:t>JJA</w:t>
+            </w:r>
+          </w:p>
+        </w:tc>
+        <w:tc>
+          <w:tcPr>
+            <w:tcW w:w="1258" w:type="dxa"/>
+            <w:noWrap/>
+            <w:hideMark/>
+          </w:tcPr>
+          <w:p>
+            <w:pPr>
+              <w:jc w:val="right"/>
+              <w:rPr>
+                <w:rFonts w:ascii="Calibri" w:eastAsia="Times New Roman" w:hAnsi="Calibri" w:cs="Calibri"/>
+                <w:color w:val="000000"/>
+                <w:lang w:val="es-CO" w:eastAsia="es-CO"/>
+              </w:rPr>
+            </w:pPr>
+            <w:r>
+              <w:rPr>
+                <w:rFonts w:ascii="Calibri" w:eastAsia="Times New Roman" w:hAnsi="Calibri" w:cs="Calibri"/>
+                <w:color w:val="000000"/>
+                <w:lang w:val="es-CO" w:eastAsia="es-CO"/>
+              </w:rPr>
+              <w:t>-0.066</w:t>
+            </w:r>
+          </w:p>
+        </w:tc>
+        <w:tc>
+          <w:tcPr>
+            <w:tcW w:w="1333" w:type="dxa"/>
+            <w:noWrap/>
+            <w:hideMark/>
+          </w:tcPr>
+          <w:p>
+            <w:pPr>
+              <w:jc w:val="right"/>
+              <w:rPr>
+                <w:rFonts w:ascii="Calibri" w:eastAsia="Times New Roman" w:hAnsi="Calibri" w:cs="Calibri"/>
+                <w:color w:val="000000"/>
+                <w:lang w:val="es-CO" w:eastAsia="es-CO"/>
+              </w:rPr>
+            </w:pPr>
+            <w:r>
+              <w:rPr>
+                <w:rFonts w:ascii="Calibri" w:eastAsia="Times New Roman" w:hAnsi="Calibri" w:cs="Calibri"/>
+                <w:color w:val="000000"/>
+                <w:lang w:val="es-CO" w:eastAsia="es-CO"/>
+              </w:rPr>
+              <w:t>0.022</w:t>
+            </w:r>
+          </w:p>
+        </w:tc>
+        <w:tc>
+          <w:tcPr>
+            <w:tcW w:w="1258" w:type="dxa"/>
+            <w:noWrap/>
+            <w:hideMark/>
+          </w:tcPr>
+          <w:p>
+            <w:pPr>
+              <w:jc w:val="right"/>
+              <w:rPr>
+                <w:rFonts w:ascii="Calibri" w:eastAsia="Times New Roman" w:hAnsi="Calibri" w:cs="Calibri"/>
+                <w:color w:val="000000"/>
+                <w:lang w:val="es-CO" w:eastAsia="es-CO"/>
+              </w:rPr>
+            </w:pPr>
+            <w:r>
+              <w:rPr>
+                <w:rFonts w:ascii="Calibri" w:eastAsia="Times New Roman" w:hAnsi="Calibri" w:cs="Calibri"/>
+                <w:color w:val="000000"/>
+                <w:lang w:val="es-CO" w:eastAsia="es-CO"/>
+              </w:rPr>
+              <w:t>0</w:t>
+            </w:r>
+          </w:p>
+        </w:tc>
+        <w:tc>
+          <w:tcPr>
+            <w:tcW w:w="1333" w:type="dxa"/>
+            <w:noWrap/>
+            <w:hideMark/>
+          </w:tcPr>
+          <w:p>
+            <w:pPr>
+              <w:jc w:val="right"/>
+              <w:rPr>
+                <w:rFonts w:ascii="Calibri" w:eastAsia="Times New Roman" w:hAnsi="Calibri" w:cs="Calibri"/>
+                <w:color w:val="000000"/>
+                <w:lang w:val="es-CO" w:eastAsia="es-CO"/>
+              </w:rPr>
+            </w:pPr>
+            <w:r>
+              <w:rPr>
+                <w:rFonts w:ascii="Calibri" w:eastAsia="Times New Roman" w:hAnsi="Calibri" w:cs="Calibri"/>
+                <w:color w:val="000000"/>
+                <w:lang w:val="es-CO" w:eastAsia="es-CO"/>
+              </w:rPr>
+              <w:t>0.015</w:t>
+            </w:r>
+          </w:p>
+        </w:tc>
+        <w:tc>
+          <w:tcPr>
+            <w:tcW w:w="1258" w:type="dxa"/>
+            <w:noWrap/>
+            <w:hideMark/>
+          </w:tcPr>
+          <w:p>
+            <w:pPr>
+              <w:jc w:val="right"/>
+              <w:rPr>
+                <w:rFonts w:ascii="Calibri" w:eastAsia="Times New Roman" w:hAnsi="Calibri" w:cs="Calibri"/>
+                <w:color w:val="000000"/>
+                <w:lang w:val="es-CO" w:eastAsia="es-CO"/>
+              </w:rPr>
+            </w:pPr>
+            <w:r>
+              <w:rPr>
+                <w:rFonts w:ascii="Calibri" w:eastAsia="Times New Roman" w:hAnsi="Calibri" w:cs="Calibri"/>
+                <w:color w:val="000000"/>
+                <w:lang w:val="es-CO" w:eastAsia="es-CO"/>
+              </w:rPr>
+              <w:t>0.399</w:t>
+            </w:r>
+          </w:p>
+        </w:tc>
+        <w:tc>
+          <w:tcPr>
+            <w:tcW w:w="1333" w:type="dxa"/>
+            <w:noWrap/>
+            <w:hideMark/>
+          </w:tcPr>
+          <w:p>
+            <w:pPr>
+              <w:jc w:val="right"/>
+              <w:rPr>
+                <w:rFonts w:ascii="Calibri" w:eastAsia="Times New Roman" w:hAnsi="Calibri" w:cs="Calibri"/>
+                <w:color w:val="000000"/>
+                <w:lang w:val="es-CO" w:eastAsia="es-CO"/>
+              </w:rPr>
+            </w:pPr>
+            <w:r>
+              <w:rPr>
+                <w:rFonts w:ascii="Calibri" w:eastAsia="Times New Roman" w:hAnsi="Calibri" w:cs="Calibri"/>
+                <w:color w:val="000000"/>
+                <w:lang w:val="es-CO" w:eastAsia="es-CO"/>
+              </w:rPr>
+              <w:t>0.068</w:t>
+            </w:r>
+          </w:p>
+        </w:tc>
+      </w:tr>
+      <w:tr>
+        <w:trPr>
+          <w:trHeight w:val="288"/>
+        </w:trPr>
+        <w:tc>
+          <w:tcPr>
+            <w:tcW w:w="1258" w:type="dxa"/>
+            <w:noWrap/>
+            <w:hideMark/>
+          </w:tcPr>
+          <w:p>
+            <w:pPr>
+              <w:jc w:val="center"/>
+              <w:rPr>
+                <w:rFonts w:ascii="Calibri" w:eastAsia="Times New Roman" w:hAnsi="Calibri" w:cs="Calibri"/>
+                <w:b/>
+                <w:bCs/>
+                <w:color w:val="000000"/>
+                <w:lang w:val="es-CO" w:eastAsia="es-CO"/>
+              </w:rPr>
+            </w:pPr>
+            <w:r>
+              <w:rPr>
+                <w:rFonts w:ascii="Calibri" w:eastAsia="Times New Roman" w:hAnsi="Calibri" w:cs="Calibri"/>
+                <w:b/>
+                <w:bCs/>
+                <w:color w:val="000000"/>
+                <w:lang w:val="es-CO" w:eastAsia="es-CO"/>
+              </w:rPr>
+              <w:t>SON</w:t>
+            </w:r>
+          </w:p>
+        </w:tc>
+        <w:tc>
+          <w:tcPr>
+            <w:tcW w:w="1258" w:type="dxa"/>
+            <w:noWrap/>
+            <w:hideMark/>
+          </w:tcPr>
+          <w:p>
+            <w:pPr>
+              <w:jc w:val="right"/>
+              <w:rPr>
+                <w:rFonts w:ascii="Calibri" w:eastAsia="Times New Roman" w:hAnsi="Calibri" w:cs="Calibri"/>
+                <w:color w:val="000000"/>
+                <w:lang w:val="es-CO" w:eastAsia="es-CO"/>
+              </w:rPr>
+            </w:pPr>
+            <w:r>
+              <w:rPr>
+                <w:rFonts w:ascii="Calibri" w:eastAsia="Times New Roman" w:hAnsi="Calibri" w:cs="Calibri"/>
+                <w:color w:val="000000"/>
+                <w:lang w:val="es-CO" w:eastAsia="es-CO"/>
+              </w:rPr>
+              <w:t>0.068</w:t>
+            </w:r>
+          </w:p>
+        </w:tc>
+        <w:tc>
+          <w:tcPr>
+            <w:tcW w:w="1333" w:type="dxa"/>
+            <w:noWrap/>
+            <w:hideMark/>
+          </w:tcPr>
+          <w:p>
+            <w:pPr>
+              <w:jc w:val="right"/>
+              <w:rPr>
+                <w:rFonts w:ascii="Calibri" w:eastAsia="Times New Roman" w:hAnsi="Calibri" w:cs="Calibri"/>
+                <w:color w:val="000000"/>
+                <w:lang w:val="es-CO" w:eastAsia="es-CO"/>
+              </w:rPr>
+            </w:pPr>
+            <w:r>
+              <w:rPr>
+                <w:rFonts w:ascii="Calibri" w:eastAsia="Times New Roman" w:hAnsi="Calibri" w:cs="Calibri"/>
+                <w:color w:val="000000"/>
+                <w:lang w:val="es-CO" w:eastAsia="es-CO"/>
+              </w:rPr>
+              <w:t>0.028</w:t>
+            </w:r>
+          </w:p>
+        </w:tc>
+        <w:tc>
+          <w:tcPr>
+            <w:tcW w:w="1258" w:type="dxa"/>
+            <w:noWrap/>
+            <w:hideMark/>
+          </w:tcPr>
+          <w:p>
+            <w:pPr>
+              <w:jc w:val="right"/>
+              <w:rPr>
+                <w:rFonts w:ascii="Calibri" w:eastAsia="Times New Roman" w:hAnsi="Calibri" w:cs="Calibri"/>
+                <w:color w:val="000000"/>
+                <w:lang w:val="es-CO" w:eastAsia="es-CO"/>
+              </w:rPr>
+            </w:pPr>
+            <w:r>
+              <w:rPr>
+                <w:rFonts w:ascii="Calibri" w:eastAsia="Times New Roman" w:hAnsi="Calibri" w:cs="Calibri"/>
+                <w:color w:val="000000"/>
+                <w:lang w:val="es-CO" w:eastAsia="es-CO"/>
+              </w:rPr>
+              <w:t>-0.001</w:t>
+            </w:r>
+          </w:p>
+        </w:tc>
+        <w:tc>
+          <w:tcPr>
+            <w:tcW w:w="1333" w:type="dxa"/>
+            <w:noWrap/>
+            <w:hideMark/>
+          </w:tcPr>
+          <w:p>
+            <w:pPr>
+              <w:jc w:val="right"/>
+              <w:rPr>
+                <w:rFonts w:ascii="Calibri" w:eastAsia="Times New Roman" w:hAnsi="Calibri" w:cs="Calibri"/>
+                <w:color w:val="000000"/>
+                <w:lang w:val="es-CO" w:eastAsia="es-CO"/>
+              </w:rPr>
+            </w:pPr>
+            <w:r>
+              <w:rPr>
+                <w:rFonts w:ascii="Calibri" w:eastAsia="Times New Roman" w:hAnsi="Calibri" w:cs="Calibri"/>
+                <w:color w:val="000000"/>
+                <w:lang w:val="es-CO" w:eastAsia="es-CO"/>
+              </w:rPr>
+              <w:t>0.026</w:t>
+            </w:r>
+          </w:p>
+        </w:tc>
+        <w:tc>
+          <w:tcPr>
+            <w:tcW w:w="1258" w:type="dxa"/>
+            <w:noWrap/>
+            <w:hideMark/>
+          </w:tcPr>
+          <w:p>
+            <w:pPr>
+              <w:jc w:val="right"/>
+              <w:rPr>
+                <w:rFonts w:ascii="Calibri" w:eastAsia="Times New Roman" w:hAnsi="Calibri" w:cs="Calibri"/>
+                <w:color w:val="000000"/>
+                <w:lang w:val="es-CO" w:eastAsia="es-CO"/>
+              </w:rPr>
+            </w:pPr>
+            <w:r>
+              <w:rPr>
+                <w:rFonts w:ascii="Calibri" w:eastAsia="Times New Roman" w:hAnsi="Calibri" w:cs="Calibri"/>
+                <w:color w:val="000000"/>
+                <w:lang w:val="es-CO" w:eastAsia="es-CO"/>
+              </w:rPr>
+              <w:t>0.429</w:t>
+            </w:r>
+          </w:p>
+        </w:tc>
+        <w:tc>
+          <w:tcPr>
+            <w:tcW w:w="1333" w:type="dxa"/>
+            <w:noWrap/>
+            <w:hideMark/>
+          </w:tcPr>
+          <w:p>
+            <w:pPr>
+              <w:jc w:val="right"/>
+              <w:rPr>
+                <w:rFonts w:ascii="Calibri" w:eastAsia="Times New Roman" w:hAnsi="Calibri" w:cs="Calibri"/>
+                <w:color w:val="000000"/>
+                <w:lang w:val="es-CO" w:eastAsia="es-CO"/>
+              </w:rPr>
+            </w:pPr>
+            <w:r>
+              <w:rPr>
+                <w:rFonts w:ascii="Calibri" w:eastAsia="Times New Roman" w:hAnsi="Calibri" w:cs="Calibri"/>
+                <w:color w:val="000000"/>
+                <w:lang w:val="es-CO" w:eastAsia="es-CO"/>
+              </w:rPr>
+              <w:t>0.112</w:t>
+            </w:r>
+          </w:p>
+        </w:tc>
+      </w:tr>
+    </w:tbl>
+    <w:p>
+      <w:pPr>
+        <w:rPr>
+          <w:lang w:val="es-419"/>
+        </w:rPr>
+      </w:pPr>
       <w:r>
         <w:rPr>
           <w:lang w:val="es-419"/>
@@ -1598,56 +4947,61 @@
     </w:p>
     <w:p>
       <w:pPr>
-        <w:pStyle w:val="Heading3"/>
-        <w:rPr>
-          <w:lang w:val="es-419"/>
-        </w:rPr>
-      </w:pPr>
-      <w:r>
-        <w:rPr>
-          <w:lang w:val="es-419"/>
-        </w:rPr>
-        <w:t>Pregunta 1.2.6</w:t>
+        <w:rPr>
+          <w:highlight w:val="yellow"/>
+          <w:lang w:val="es-419"/>
+        </w:rPr>
+      </w:pPr>
+      <w:r>
+        <w:rPr>
+          <w:highlight w:val="yellow"/>
+          <w:lang w:val="es-419"/>
+        </w:rPr>
+        <w:t>A partir de la tabla se observa que las medias difieren tanto entre periodos como entre estaciones. En particular, las estaciones de mitad de año pueden considerarse como una referencia en el periodo 1951–1980, ya que sus anomalías promedio se aproximan a 0, lo cual es consistente con el hecho de que este periodo se utiliza como base para calcular las anomalías.</w:t>
       </w:r>
     </w:p>
     <w:p>
       <w:pPr>
         <w:rPr>
-          <w:lang w:val="es-419"/>
-        </w:rPr>
-      </w:pPr>
-      <w:r>
-        <w:rPr>
-          <w:lang w:val="es-419"/>
-        </w:rPr>
-        <w:t>Con base en el artículo y tus respuestas, ¿aconsejarías al gobierno gastar más recursos en mitigar los efectos de eventos climáticos extremos?</w:t>
+          <w:highlight w:val="yellow"/>
+          <w:lang w:val="es-419"/>
+        </w:rPr>
+      </w:pPr>
+      <w:r>
+        <w:rPr>
+          <w:highlight w:val="yellow"/>
+          <w:lang w:val="es-419"/>
+        </w:rPr>
+        <w:lastRenderedPageBreak/>
+        <w:t>En cuanto a las varianzas, se puede observar que durante los periodos 1921–1950 y 1951–1980 la variabilidad de las temperaturas es relativamente similar entre ambos periodos y mantiene un patrón comparable entre estaciones. Esto se evidencia en que las varianzas presentan valores cercanos entre sí, sin diferencias muy marcadas.</w:t>
       </w:r>
     </w:p>
     <w:p>
       <w:pPr>
-        <w:pStyle w:val="Heading2"/>
-        <w:rPr>
-          <w:lang w:val="es-419"/>
-        </w:rPr>
-      </w:pPr>
-      <w:r>
-        <w:rPr>
-          <w:lang w:val="es-419"/>
-        </w:rPr>
-        <w:t>Parte 1.3. CO₂ y su relación con la temperatura</w:t>
+        <w:rPr>
+          <w:lang w:val="es-419"/>
+        </w:rPr>
+      </w:pPr>
+      <w:r>
+        <w:rPr>
+          <w:highlight w:val="yellow"/>
+          <w:lang w:val="es-419"/>
+        </w:rPr>
+        <w:t>Por otro lado, en el periodo 1981–2010 se observa un aumento tanto en las medias como en varias de las varianzas, lo que sugiere no solo un incremento en las temperaturas promedio, sino también una mayor dispersión en las anomalías. Esto puede interpretarse como un indicio de temperaturas más altas y, en algunos casos, una mayor variabilidad en comparación con los periodos anteriores.</w:t>
       </w:r>
     </w:p>
     <w:p>
       <w:pPr>
-        <w:rPr>
-          <w:lang w:val="es-419"/>
-        </w:rPr>
-      </w:pPr>
-      <w:r>
-        <w:rPr>
-          <w:lang w:val="es-419"/>
-        </w:rPr>
-        <w:t xml:space="preserve">El dióxido de carbono (CO₂) es uno de los principales gases de efecto invernadero. Su concentración en la atmósfera ha aumentado de manera constante desde mediados del siglo XX, y este cambio está fuertemente vinculado con la actividad humana. </w:t>
+        <w:pStyle w:val="Heading3"/>
+        <w:rPr>
+          <w:lang w:val="es-419"/>
+        </w:rPr>
+      </w:pPr>
+      <w:r>
+        <w:rPr>
+          <w:lang w:val="es-419"/>
+        </w:rPr>
+        <w:t>Pregunta 1.2.6</w:t>
       </w:r>
     </w:p>
     <w:p>
@@ -1660,23 +5014,91 @@
         <w:rPr>
           <w:lang w:val="es-419"/>
         </w:rPr>
-        <w:lastRenderedPageBreak/>
-        <w:t>El observatorio de Mauna Loa (Hawái) es una de las series de datos más conocidas para medir estos cambios.</w:t>
-      </w:r>
-      <w:r>
-        <w:rPr>
-          <w:lang w:val="es-419"/>
-        </w:rPr>
-        <w:t xml:space="preserve"> Vamos a utilizar la siguiente base de datos:</w:t>
+        <w:t>Con base en el artículo y tus respuestas, ¿aconsejarías al gobierno gastar más recursos en mitigar los efectos de eventos climáticos extremos?</w:t>
       </w:r>
     </w:p>
     <w:p>
       <w:pPr>
         <w:rPr>
-          <w:lang w:val="es-419"/>
-        </w:rPr>
-      </w:pPr>
-      <w:hyperlink r:id="rId16" w:history="1">
+          <w:highlight w:val="yellow"/>
+          <w:lang w:val="es-CO"/>
+        </w:rPr>
+      </w:pPr>
+      <w:r>
+        <w:rPr>
+          <w:highlight w:val="yellow"/>
+          <w:lang w:val="es-CO"/>
+        </w:rPr>
+        <w:t>Según los datos derivados del análisis entre periodos, se observa un cambio drástico en términos de las anomalías en el último periodo, que corresponde a nuestro pasado más reciente. El periodo 1981–2010 muestra una señal clara de que las temperaturas se han vuelto cada vez más altas en comparación con los periodos anteriores, en los cuales las anomalías eran más predecibles y se encontraban más centradas alrededor de la media (es decir, con menores desviaciones respecto al promedio).</w:t>
+      </w:r>
+    </w:p>
+    <w:p>
+      <w:pPr>
+        <w:rPr>
+          <w:lang w:val="es-CO"/>
+        </w:rPr>
+      </w:pPr>
+      <w:r>
+        <w:rPr>
+          <w:highlight w:val="yellow"/>
+          <w:lang w:val="es-CO"/>
+        </w:rPr>
+        <w:t>Por este motivo, es importante que los gobiernos tomen conciencia de que existe un cambio real en el comportamiento de las temperaturas y que se deben implementar medidas para mitigar sus efectos, con el fin de prevenir futuros problemas asociados al calentamiento del planeta.</w:t>
+      </w:r>
+    </w:p>
+    <w:p>
+      <w:pPr>
+        <w:pStyle w:val="Heading2"/>
+        <w:rPr>
+          <w:lang w:val="es-419"/>
+        </w:rPr>
+      </w:pPr>
+      <w:r>
+        <w:rPr>
+          <w:lang w:val="es-419"/>
+        </w:rPr>
+        <w:t>Parte 1.3. CO₂ y su relación con la temperatura</w:t>
+      </w:r>
+    </w:p>
+    <w:p>
+      <w:pPr>
+        <w:rPr>
+          <w:lang w:val="es-419"/>
+        </w:rPr>
+      </w:pPr>
+      <w:r>
+        <w:rPr>
+          <w:lang w:val="es-419"/>
+        </w:rPr>
+        <w:t xml:space="preserve">El dióxido de carbono (CO₂) es uno de los principales gases de efecto invernadero. Su concentración en la atmósfera ha aumentado de manera constante desde mediados del siglo XX, y este cambio está fuertemente vinculado con la actividad humana. </w:t>
+      </w:r>
+    </w:p>
+    <w:p>
+      <w:pPr>
+        <w:rPr>
+          <w:lang w:val="es-419"/>
+        </w:rPr>
+      </w:pPr>
+      <w:r>
+        <w:rPr>
+          <w:lang w:val="es-419"/>
+        </w:rPr>
+        <w:t>El observatorio de Mauna Loa (Hawái) es una de las series de datos más conocidas para medir estos cambios.</w:t>
+      </w:r>
+      <w:r>
+        <w:rPr>
+          <w:lang w:val="es-419"/>
+        </w:rPr>
+        <w:t xml:space="preserve"> Vamos a utilizar la siguiente base de datos:</w:t>
+      </w:r>
+    </w:p>
+    <w:p>
+      <w:pPr>
+        <w:rPr>
+          <w:lang w:val="es-419"/>
+        </w:rPr>
+      </w:pPr>
+      <w:hyperlink r:id="rId17" w:history="1">
         <w:r>
           <w:rPr>
             <w:rStyle w:val="Hyperlink"/>
@@ -1726,7 +5148,7 @@
         <w:br/>
         <w:t xml:space="preserve">- ¿Consideras que son una representación confiable de la atmósfera global? Explica usando el artículo del </w:t>
       </w:r>
-      <w:hyperlink r:id="rId17" w:history="1">
+      <w:hyperlink r:id="rId18" w:history="1">
         <w:r>
           <w:rPr>
             <w:rStyle w:val="Hyperlink"/>
@@ -1794,6 +5216,7 @@
         <w:rPr>
           <w:lang w:val="es-419"/>
         </w:rPr>
+        <w:lastRenderedPageBreak/>
         <w:t>Pregunta 1.3.2</w:t>
       </w:r>
     </w:p>
@@ -2045,7 +5468,7 @@
         </w:rPr>
         <w:t xml:space="preserve"> Ver video </w:t>
       </w:r>
-      <w:hyperlink r:id="rId18" w:history="1">
+      <w:hyperlink r:id="rId19" w:history="1">
         <w:r>
           <w:rPr>
             <w:rStyle w:val="Hyperlink"/>
@@ -3228,7 +6651,6 @@
   <w:style w:type="character" w:default="1" w:styleId="DefaultParagraphFont">
     <w:name w:val="Default Paragraph Font"/>
     <w:uiPriority w:val="1"/>
-    <w:semiHidden/>
     <w:unhideWhenUsed/>
   </w:style>
   <w:style w:type="table" w:default="1" w:styleId="TableNormal">

</xml_diff>

<commit_message>
Add climate analysis outputs and refactor script
Add raw data, documentation and generated outputs for Taller 3; update and refactor the main analysis script. New files: raw Excel data, NOAA PDF, workshop PDF, CO2/temperature graphs and correlation table. Modified: several output tables (deciles, stations, hot anomalies, period tables) and the Python script (reorganized into clear sections, improved path handling, plotting, frequency tables, histograms, decile calculations, station means/variances, CO2 time series, CO2–temperature merge/correlation). Exports graphs and Excel summary tables to Outputs/Graphs and Outputs/Tables.
</commit_message>
<xml_diff>
--- a/Documents/Taller 3 Doing Economics 1 Climate Change_3A.docx
+++ b/Documents/Taller 3 Doing Economics 1 Climate Change_3A.docx
@@ -5207,21 +5207,173 @@
     </w:p>
     <w:p>
       <w:pPr>
-        <w:pStyle w:val="Heading3"/>
-        <w:rPr>
-          <w:lang w:val="es-419"/>
-        </w:rPr>
-      </w:pPr>
-      <w:r>
-        <w:rPr>
+        <w:rPr>
+          <w:highlight w:val="yellow"/>
+          <w:lang w:val="es-CO"/>
+        </w:rPr>
+      </w:pPr>
+      <w:r>
+        <w:rPr>
+          <w:highlight w:val="yellow"/>
+          <w:lang w:val="es-419"/>
+        </w:rPr>
+        <w:t xml:space="preserve">Sí, los datos de CO₂ medidos en Mauna Loa pueden considerarse representativos de la atmósfera global. El observatorio está ubicado a gran altitud (3400 m), lo que permite </w:t>
+      </w:r>
+      <w:r>
+        <w:rPr>
+          <w:highlight w:val="yellow"/>
           <w:lang w:val="es-419"/>
         </w:rPr>
         <w:lastRenderedPageBreak/>
-        <w:t>Pregunta 1.3.2</w:t>
+        <w:t>medir masas de aire que representan áreas muy amplias y no solo condiciones locales. Además, las mediciones se calibran constantemente y se comparan con métodos independientes, logrando una precisión cercana a 0.2 ppm. Por estas razones, estos registros son una referencia confiable para analizar el comportamiento global del CO₂</w:t>
+      </w:r>
+      <w:r>
+        <w:rPr>
+          <w:highlight w:val="yellow"/>
+          <w:lang w:val="es-419"/>
+        </w:rPr>
+        <w:t>, según lo explica el articulo</w:t>
+      </w:r>
+      <w:r>
+        <w:rPr>
+          <w:highlight w:val="yellow"/>
+          <w:lang w:val="es-419"/>
+        </w:rPr>
+        <w:t xml:space="preserve"> “</w:t>
+      </w:r>
+      <w:r>
+        <w:rPr>
+          <w:highlight w:val="yellow"/>
+          <w:lang w:val="es-CO"/>
+        </w:rPr>
+        <w:t xml:space="preserve">How </w:t>
+      </w:r>
+      <w:proofErr w:type="spellStart"/>
+      <w:r>
+        <w:rPr>
+          <w:highlight w:val="yellow"/>
+          <w:lang w:val="es-CO"/>
+        </w:rPr>
+        <w:t>we</w:t>
+      </w:r>
+      <w:proofErr w:type="spellEnd"/>
+      <w:r>
+        <w:rPr>
+          <w:highlight w:val="yellow"/>
+          <w:lang w:val="es-CO"/>
+        </w:rPr>
+        <w:t xml:space="preserve"> </w:t>
+      </w:r>
+      <w:proofErr w:type="spellStart"/>
+      <w:r>
+        <w:rPr>
+          <w:highlight w:val="yellow"/>
+          <w:lang w:val="es-CO"/>
+        </w:rPr>
+        <w:t>measure</w:t>
+      </w:r>
+      <w:proofErr w:type="spellEnd"/>
+      <w:r>
+        <w:rPr>
+          <w:highlight w:val="yellow"/>
+          <w:lang w:val="es-CO"/>
+        </w:rPr>
+        <w:t xml:space="preserve"> </w:t>
+      </w:r>
+      <w:proofErr w:type="spellStart"/>
+      <w:r>
+        <w:rPr>
+          <w:highlight w:val="yellow"/>
+          <w:lang w:val="es-CO"/>
+        </w:rPr>
+        <w:t>background</w:t>
+      </w:r>
+      <w:proofErr w:type="spellEnd"/>
+      <w:r>
+        <w:rPr>
+          <w:highlight w:val="yellow"/>
+          <w:lang w:val="es-CO"/>
+        </w:rPr>
+        <w:t xml:space="preserve"> CO</w:t>
+      </w:r>
+      <w:r>
+        <w:rPr>
+          <w:highlight w:val="yellow"/>
+          <w:vertAlign w:val="subscript"/>
+          <w:lang w:val="es-CO"/>
+        </w:rPr>
+        <w:t>2</w:t>
+      </w:r>
+      <w:r>
+        <w:rPr>
+          <w:highlight w:val="yellow"/>
+          <w:lang w:val="es-CO"/>
+        </w:rPr>
+        <w:t> </w:t>
+      </w:r>
+      <w:proofErr w:type="spellStart"/>
+      <w:r>
+        <w:rPr>
+          <w:highlight w:val="yellow"/>
+          <w:lang w:val="es-CO"/>
+        </w:rPr>
+        <w:t>levels</w:t>
+      </w:r>
+      <w:proofErr w:type="spellEnd"/>
+      <w:r>
+        <w:rPr>
+          <w:highlight w:val="yellow"/>
+          <w:lang w:val="es-CO"/>
+        </w:rPr>
+        <w:t xml:space="preserve"> </w:t>
+      </w:r>
+      <w:proofErr w:type="spellStart"/>
+      <w:r>
+        <w:rPr>
+          <w:highlight w:val="yellow"/>
+          <w:lang w:val="es-CO"/>
+        </w:rPr>
+        <w:t>on</w:t>
+      </w:r>
+      <w:proofErr w:type="spellEnd"/>
+      <w:r>
+        <w:rPr>
+          <w:highlight w:val="yellow"/>
+          <w:lang w:val="es-CO"/>
+        </w:rPr>
+        <w:t xml:space="preserve"> Mauna Loa</w:t>
+      </w:r>
+      <w:r>
+        <w:rPr>
+          <w:highlight w:val="yellow"/>
+          <w:lang w:val="es-CO"/>
+        </w:rPr>
+        <w:t>”</w:t>
+      </w:r>
+      <w:r>
+        <w:rPr>
+          <w:highlight w:val="yellow"/>
+          <w:lang w:val="es-CO"/>
+        </w:rPr>
+        <w:t>.</w:t>
       </w:r>
     </w:p>
     <w:p>
       <w:pPr>
+        <w:pStyle w:val="Heading3"/>
+        <w:rPr>
+          <w:lang w:val="es-419"/>
+        </w:rPr>
+      </w:pPr>
+      <w:r>
+        <w:rPr>
+          <w:lang w:val="es-419"/>
+        </w:rPr>
+        <w:t>Pregunta 1.3.2</w:t>
+      </w:r>
+    </w:p>
+    <w:p>
+      <w:pPr>
         <w:rPr>
           <w:lang w:val="es-419"/>
         </w:rPr>
@@ -5267,26 +5419,51 @@
         <w:br/>
         <w:t>- Explica la diferencia en tus propias palabras.</w:t>
       </w:r>
-      <w:r>
-        <w:rPr>
-          <w:lang w:val="es-419"/>
-        </w:rPr>
-        <w:br/>
-        <w:t>- ¿Por qué podría haber variación estacional en los niveles de CO₂?</w:t>
-      </w:r>
     </w:p>
     <w:p>
       <w:pPr>
-        <w:pStyle w:val="Heading3"/>
-        <w:rPr>
-          <w:lang w:val="es-419"/>
-        </w:rPr>
-      </w:pPr>
-      <w:r>
-        <w:rPr>
-          <w:lang w:val="es-419"/>
-        </w:rPr>
-        <w:t>Pregunta 1.3.3</w:t>
+        <w:rPr>
+          <w:lang w:val="es-419"/>
+        </w:rPr>
+      </w:pPr>
+      <w:r>
+        <w:rPr>
+          <w:highlight w:val="yellow"/>
+          <w:lang w:val="es-419"/>
+        </w:rPr>
+        <w:t xml:space="preserve">La variable </w:t>
+      </w:r>
+      <w:proofErr w:type="spellStart"/>
+      <w:r>
+        <w:rPr>
+          <w:highlight w:val="yellow"/>
+          <w:lang w:val="es-419"/>
+        </w:rPr>
+        <w:t>interpolated</w:t>
+      </w:r>
+      <w:proofErr w:type="spellEnd"/>
+      <w:r>
+        <w:rPr>
+          <w:highlight w:val="yellow"/>
+          <w:lang w:val="es-419"/>
+        </w:rPr>
+        <w:t xml:space="preserve"> representa los valores observados de CO₂ completados cuando hay datos faltantes, manteniendo las fluctuaciones reales de la serie. En cambio, </w:t>
+      </w:r>
+      <w:proofErr w:type="spellStart"/>
+      <w:r>
+        <w:rPr>
+          <w:highlight w:val="yellow"/>
+          <w:lang w:val="es-419"/>
+        </w:rPr>
+        <w:t>trend</w:t>
+      </w:r>
+      <w:proofErr w:type="spellEnd"/>
+      <w:r>
+        <w:rPr>
+          <w:highlight w:val="yellow"/>
+          <w:lang w:val="es-419"/>
+        </w:rPr>
+        <w:t xml:space="preserve"> busca capturar la tendencia de largo plazo, eliminando parte de las variaciones de corto plazo o estacionales para mostrar con mayor claridad el aumento sostenido del CO₂ en el tiempo.</w:t>
       </w:r>
     </w:p>
     <w:p>
@@ -5299,6 +5476,47 @@
         <w:rPr>
           <w:lang w:val="es-419"/>
         </w:rPr>
+        <w:t>- ¿Por qué podría haber variación estacional en los niveles de CO₂?</w:t>
+      </w:r>
+    </w:p>
+    <w:p>
+      <w:pPr>
+        <w:rPr>
+          <w:lang w:val="es-419"/>
+        </w:rPr>
+      </w:pPr>
+      <w:r>
+        <w:rPr>
+          <w:highlight w:val="yellow"/>
+          <w:lang w:val="es-419"/>
+        </w:rPr>
+        <w:t>La variación estacional del CO₂ se explica principalmente por los ciclos naturales de la vegetación. Durante la primavera y el verano las plantas absorben más CO₂ mediante la fotosíntesis, reduciendo su concentración en la atmósfera; mientras que en otoño e invierno la fotosíntesis disminuye y la descomposición de materia orgánica libera más CO₂, aumentando sus niveles.</w:t>
+      </w:r>
+    </w:p>
+    <w:p>
+      <w:pPr>
+        <w:pStyle w:val="Heading3"/>
+        <w:rPr>
+          <w:lang w:val="es-419"/>
+        </w:rPr>
+      </w:pPr>
+      <w:r>
+        <w:rPr>
+          <w:lang w:val="es-419"/>
+        </w:rPr>
+        <w:t>Pregunta 1.3.3</w:t>
+      </w:r>
+    </w:p>
+    <w:p>
+      <w:pPr>
+        <w:rPr>
+          <w:lang w:val="es-419"/>
+        </w:rPr>
+      </w:pPr>
+      <w:r>
+        <w:rPr>
+          <w:lang w:val="es-419"/>
+        </w:rPr>
         <w:t>Grafica una línea con los niveles de CO₂ (</w:t>
       </w:r>
       <w:proofErr w:type="spellStart"/>
@@ -5336,26 +5554,67 @@
         <w:br/>
         <w:t>- Etiqueta los ejes, incluye la leyenda y titula el gráfico.</w:t>
       </w:r>
-      <w:r>
-        <w:rPr>
-          <w:lang w:val="es-419"/>
-        </w:rPr>
-        <w:br/>
-        <w:t>- ¿Qué sugiere este gráfico sobre la relación entre CO₂ y tiempo?</w:t>
-      </w:r>
     </w:p>
     <w:p>
       <w:pPr>
-        <w:pStyle w:val="Heading3"/>
-        <w:rPr>
-          <w:lang w:val="es-419"/>
-        </w:rPr>
-      </w:pPr>
-      <w:r>
-        <w:rPr>
-          <w:lang w:val="es-419"/>
-        </w:rPr>
-        <w:t>Pregunta 1.3.4</w:t>
+        <w:jc w:val="center"/>
+        <w:rPr>
+          <w:lang w:val="es-419"/>
+        </w:rPr>
+      </w:pPr>
+      <w:r>
+        <w:rPr>
+          <w:noProof/>
+          <w:lang w:val="es-419"/>
+        </w:rPr>
+        <w:drawing>
+          <wp:inline distT="0" distB="0" distL="0" distR="0" wp14:anchorId="05AC10FD" wp14:editId="1036746F">
+            <wp:extent cx="4610100" cy="2750672"/>
+            <wp:effectExtent l="0" t="0" r="0" b="0"/>
+            <wp:docPr id="1694435696" name="Picture 2"/>
+            <wp:cNvGraphicFramePr>
+              <a:graphicFrameLocks xmlns:a="http://schemas.openxmlformats.org/drawingml/2006/main" noChangeAspect="1"/>
+            </wp:cNvGraphicFramePr>
+            <a:graphic xmlns:a="http://schemas.openxmlformats.org/drawingml/2006/main">
+              <a:graphicData uri="http://schemas.openxmlformats.org/drawingml/2006/picture">
+                <pic:pic xmlns:pic="http://schemas.openxmlformats.org/drawingml/2006/picture">
+                  <pic:nvPicPr>
+                    <pic:cNvPr id="0" name="Picture 2"/>
+                    <pic:cNvPicPr>
+                      <a:picLocks noChangeAspect="1" noChangeArrowheads="1"/>
+                    </pic:cNvPicPr>
+                  </pic:nvPicPr>
+                  <pic:blipFill>
+                    <a:blip r:embed="rId19">
+                      <a:extLst>
+                        <a:ext uri="{28A0092B-C50C-407E-A947-70E740481C1C}">
+                          <a14:useLocalDpi xmlns:a14="http://schemas.microsoft.com/office/drawing/2010/main" val="0"/>
+                        </a:ext>
+                      </a:extLst>
+                    </a:blip>
+                    <a:srcRect/>
+                    <a:stretch>
+                      <a:fillRect/>
+                    </a:stretch>
+                  </pic:blipFill>
+                  <pic:spPr bwMode="auto">
+                    <a:xfrm>
+                      <a:off x="0" y="0"/>
+                      <a:ext cx="4618781" cy="2755852"/>
+                    </a:xfrm>
+                    <a:prstGeom prst="rect">
+                      <a:avLst/>
+                    </a:prstGeom>
+                    <a:noFill/>
+                    <a:ln>
+                      <a:noFill/>
+                    </a:ln>
+                  </pic:spPr>
+                </pic:pic>
+              </a:graphicData>
+            </a:graphic>
+          </wp:inline>
+        </w:drawing>
       </w:r>
     </w:p>
     <w:p>
@@ -5368,6 +5627,64 @@
         <w:rPr>
           <w:lang w:val="es-419"/>
         </w:rPr>
+        <w:t>- ¿Qué sugiere este gráfico sobre la relación entre CO₂ y tiempo?</w:t>
+      </w:r>
+    </w:p>
+    <w:p>
+      <w:pPr>
+        <w:rPr>
+          <w:lang w:val="es-419"/>
+        </w:rPr>
+      </w:pPr>
+      <w:r>
+        <w:rPr>
+          <w:highlight w:val="yellow"/>
+          <w:lang w:val="es-419"/>
+        </w:rPr>
+        <w:lastRenderedPageBreak/>
+        <w:t xml:space="preserve">La relación que sugiere este gráfico entre las emisiones de CO₂ y el tiempo es un aumento constante y sostenido en el largo plazo. Esto se observa en la línea de tendencia, que muestra un crecimiento progresivo de los niveles de CO₂ a lo largo del tiempo. Por su parte, la serie </w:t>
+      </w:r>
+      <w:proofErr w:type="spellStart"/>
+      <w:r>
+        <w:rPr>
+          <w:highlight w:val="yellow"/>
+          <w:lang w:val="es-419"/>
+        </w:rPr>
+        <w:t>interpolated</w:t>
+      </w:r>
+      <w:proofErr w:type="spellEnd"/>
+      <w:r>
+        <w:rPr>
+          <w:highlight w:val="yellow"/>
+          <w:lang w:val="es-419"/>
+        </w:rPr>
+        <w:t xml:space="preserve"> evidencia variaciones estacionales que oscilan alrededor de esta tendencia, reflejando cambios recurrentes entre estaciones, pero manteniendo como hecho principal el aumento continuo de las concentraciones de CO₂ con el paso del tiempo.</w:t>
+      </w:r>
+    </w:p>
+    <w:p>
+      <w:pPr>
+        <w:pStyle w:val="Heading3"/>
+        <w:rPr>
+          <w:lang w:val="es-419"/>
+        </w:rPr>
+      </w:pPr>
+      <w:r>
+        <w:rPr>
+          <w:lang w:val="es-419"/>
+        </w:rPr>
+        <w:t>Pregunta 1.3.4</w:t>
+      </w:r>
+    </w:p>
+    <w:p>
+      <w:pPr>
+        <w:rPr>
+          <w:lang w:val="es-419"/>
+        </w:rPr>
+      </w:pPr>
+      <w:r>
+        <w:rPr>
+          <w:lang w:val="es-419"/>
+        </w:rPr>
         <w:t>Elige un mes y añade los datos de la tendencia del CO₂ al conjunto de anomalías de temperatura de la Parte 1.1.</w:t>
       </w:r>
       <w:r>
@@ -5377,19 +5694,213 @@
         <w:br/>
         <w:t>- Haz un diagrama de dispersión (CO₂ en el eje vertical, anomalía de temperatura en el horizontal).</w:t>
       </w:r>
-      <w:r>
-        <w:rPr>
-          <w:lang w:val="es-419"/>
-        </w:rPr>
-        <w:br/>
+    </w:p>
+    <w:p>
+      <w:pPr>
+        <w:jc w:val="center"/>
+        <w:rPr>
+          <w:lang w:val="es-419"/>
+        </w:rPr>
+      </w:pPr>
+      <w:r>
+        <w:rPr>
+          <w:noProof/>
+          <w:lang w:val="es-419"/>
+        </w:rPr>
+        <w:drawing>
+          <wp:inline distT="0" distB="0" distL="0" distR="0" wp14:anchorId="27D28F25" wp14:editId="6FE5009A">
+            <wp:extent cx="3398520" cy="2548890"/>
+            <wp:effectExtent l="0" t="0" r="0" b="3810"/>
+            <wp:docPr id="1901551467" name="Picture 3"/>
+            <wp:cNvGraphicFramePr>
+              <a:graphicFrameLocks xmlns:a="http://schemas.openxmlformats.org/drawingml/2006/main" noChangeAspect="1"/>
+            </wp:cNvGraphicFramePr>
+            <a:graphic xmlns:a="http://schemas.openxmlformats.org/drawingml/2006/main">
+              <a:graphicData uri="http://schemas.openxmlformats.org/drawingml/2006/picture">
+                <pic:pic xmlns:pic="http://schemas.openxmlformats.org/drawingml/2006/picture">
+                  <pic:nvPicPr>
+                    <pic:cNvPr id="0" name="Picture 3"/>
+                    <pic:cNvPicPr>
+                      <a:picLocks noChangeAspect="1" noChangeArrowheads="1"/>
+                    </pic:cNvPicPr>
+                  </pic:nvPicPr>
+                  <pic:blipFill>
+                    <a:blip r:embed="rId20">
+                      <a:extLst>
+                        <a:ext uri="{28A0092B-C50C-407E-A947-70E740481C1C}">
+                          <a14:useLocalDpi xmlns:a14="http://schemas.microsoft.com/office/drawing/2010/main" val="0"/>
+                        </a:ext>
+                      </a:extLst>
+                    </a:blip>
+                    <a:srcRect/>
+                    <a:stretch>
+                      <a:fillRect/>
+                    </a:stretch>
+                  </pic:blipFill>
+                  <pic:spPr bwMode="auto">
+                    <a:xfrm>
+                      <a:off x="0" y="0"/>
+                      <a:ext cx="3398520" cy="2548890"/>
+                    </a:xfrm>
+                    <a:prstGeom prst="rect">
+                      <a:avLst/>
+                    </a:prstGeom>
+                    <a:noFill/>
+                    <a:ln>
+                      <a:noFill/>
+                    </a:ln>
+                  </pic:spPr>
+                </pic:pic>
+              </a:graphicData>
+            </a:graphic>
+          </wp:inline>
+        </w:drawing>
+      </w:r>
+      <w:r>
+        <w:rPr>
+          <w:lang w:val="es-419"/>
+        </w:rPr>
+        <w:t>}</w:t>
+      </w:r>
+    </w:p>
+    <w:p>
+      <w:pPr>
+        <w:rPr>
+          <w:lang w:val="es-419"/>
+        </w:rPr>
+      </w:pPr>
+      <w:r>
+        <w:rPr>
+          <w:lang w:val="es-419"/>
+        </w:rPr>
         <w:t>- Calcula el coeficiente de correlación de Pearson.</w:t>
       </w:r>
+    </w:p>
+    <w:tbl>
+      <w:tblPr>
+        <w:tblStyle w:val="TableGrid"/>
+        <w:tblW w:w="1062" w:type="dxa"/>
+        <w:tblLook w:val="04A0" w:firstRow="1" w:lastRow="0" w:firstColumn="1" w:lastColumn="0" w:noHBand="0" w:noVBand="1"/>
+      </w:tblPr>
+      <w:tblGrid>
+        <w:gridCol w:w="1248"/>
+      </w:tblGrid>
+      <w:tr>
+        <w:trPr>
+          <w:trHeight w:val="288"/>
+        </w:trPr>
+        <w:tc>
+          <w:tcPr>
+            <w:tcW w:w="1062" w:type="dxa"/>
+            <w:noWrap/>
+            <w:hideMark/>
+          </w:tcPr>
+          <w:p>
+            <w:pPr>
+              <w:jc w:val="center"/>
+              <w:rPr>
+                <w:rFonts w:ascii="Calibri" w:eastAsia="Times New Roman" w:hAnsi="Calibri" w:cs="Calibri"/>
+                <w:b/>
+                <w:bCs/>
+                <w:color w:val="000000"/>
+                <w:lang w:val="es-CO" w:eastAsia="es-CO"/>
+              </w:rPr>
+            </w:pPr>
+            <w:proofErr w:type="spellStart"/>
+            <w:r>
+              <w:rPr>
+                <w:rFonts w:ascii="Calibri" w:eastAsia="Times New Roman" w:hAnsi="Calibri" w:cs="Calibri"/>
+                <w:b/>
+                <w:bCs/>
+                <w:color w:val="000000"/>
+                <w:lang w:val="es-CO" w:eastAsia="es-CO"/>
+              </w:rPr>
+              <w:t>Correlation</w:t>
+            </w:r>
+            <w:proofErr w:type="spellEnd"/>
+          </w:p>
+        </w:tc>
+      </w:tr>
+      <w:tr>
+        <w:trPr>
+          <w:trHeight w:val="288"/>
+        </w:trPr>
+        <w:tc>
+          <w:tcPr>
+            <w:tcW w:w="1062" w:type="dxa"/>
+            <w:noWrap/>
+            <w:hideMark/>
+          </w:tcPr>
+          <w:p>
+            <w:pPr>
+              <w:jc w:val="right"/>
+              <w:rPr>
+                <w:rFonts w:ascii="Calibri" w:eastAsia="Times New Roman" w:hAnsi="Calibri" w:cs="Calibri"/>
+                <w:color w:val="000000"/>
+                <w:lang w:val="es-CO" w:eastAsia="es-CO"/>
+              </w:rPr>
+            </w:pPr>
+            <w:r>
+              <w:rPr>
+                <w:rFonts w:ascii="Calibri" w:eastAsia="Times New Roman" w:hAnsi="Calibri" w:cs="Calibri"/>
+                <w:color w:val="000000"/>
+                <w:lang w:val="es-CO" w:eastAsia="es-CO"/>
+              </w:rPr>
+              <w:t>0.829</w:t>
+            </w:r>
+          </w:p>
+        </w:tc>
+      </w:tr>
+    </w:tbl>
+    <w:p>
+      <w:pPr>
+        <w:rPr>
+          <w:lang w:val="es-419"/>
+        </w:rPr>
+      </w:pPr>
       <w:r>
         <w:rPr>
           <w:lang w:val="es-419"/>
         </w:rPr>
         <w:br/>
         <w:t>- Interpreta el resultado y discute sus limitaciones.</w:t>
+      </w:r>
+    </w:p>
+    <w:p>
+      <w:pPr>
+        <w:rPr>
+          <w:highlight w:val="yellow"/>
+          <w:lang w:val="es-419"/>
+        </w:rPr>
+      </w:pPr>
+      <w:r>
+        <w:rPr>
+          <w:highlight w:val="yellow"/>
+          <w:lang w:val="es-419"/>
+        </w:rPr>
+        <w:t>En este caso se seleccionó el mes de enero para comparar las anomalías de temperatura con las concentraciones de CO₂ en la atmósfera, con el objetivo de analizar qué relación pueden mantener estas variables. A partir de los resultados se puede concluir que existe una alta correlación positiva entre ambas variables, lo cual también se evidencia en la nube de puntos del diagrama de dispersión.</w:t>
+      </w:r>
+    </w:p>
+    <w:p>
+      <w:pPr>
+        <w:rPr>
+          <w:lang w:val="es-419"/>
+        </w:rPr>
+      </w:pPr>
+      <w:r>
+        <w:rPr>
+          <w:highlight w:val="yellow"/>
+          <w:lang w:val="es-419"/>
+        </w:rPr>
+        <w:t xml:space="preserve">No obstante, el hecho de encontrar una correlación alta no implica necesariamente una relación causal. Es decir, no podemos afirmar que un aumento en la temperatura cause directamente un aumento en las emisiones o concentraciones de CO₂. Pueden existir otros factores que expliquen simultáneamente el comportamiento de ambas variables. Por lo </w:t>
+      </w:r>
+      <w:r>
+        <w:rPr>
+          <w:highlight w:val="yellow"/>
+          <w:lang w:val="es-419"/>
+        </w:rPr>
+        <w:lastRenderedPageBreak/>
+        <w:t>tanto, la evidencia únicamente permite afirmar la existencia de una relación positiva entre las variables, pero no permite realizar una inferencia causal sobre el mecanismo que explica este fenómeno.</w:t>
       </w:r>
     </w:p>
     <w:p>
@@ -5468,7 +5979,7 @@
         </w:rPr>
         <w:t xml:space="preserve"> Ver video </w:t>
       </w:r>
-      <w:hyperlink r:id="rId19" w:history="1">
+      <w:hyperlink r:id="rId21" w:history="1">
         <w:r>
           <w:rPr>
             <w:rStyle w:val="Hyperlink"/>
@@ -5505,6 +6016,22 @@
           <w:lang w:val="es-419"/>
         </w:rPr>
         <w:br/>
+      </w:r>
+      <w:r>
+        <w:rPr>
+          <w:lang w:val="es-419"/>
+        </w:rPr>
+        <w:br/>
+      </w:r>
+      <w:r>
+        <w:rPr>
+          <w:rFonts w:ascii="Times New Roman" w:eastAsia="Times New Roman" w:hAnsi="Times New Roman" w:cs="Times New Roman"/>
+          <w:sz w:val="24"/>
+          <w:szCs w:val="24"/>
+          <w:highlight w:val="yellow"/>
+          <w:lang w:val="es-419" w:eastAsia="es-419"/>
+        </w:rPr>
+        <w:t>Una posible correlación espuria podría observarse entre el aumento de las concentraciones de CO₂ y el uso de bicicletas en las ciudades. Ambas variables podrían mostrar una correlación positiva a lo largo del tiempo, ya que el uso de bicicletas ha aumentado en muchos lugares mientras también lo han hecho las concentraciones de CO₂. Sin embargo, esto no implica que una variable cause la otra, sino que ambas pueden estar evolucionando simultáneamente por razones distintas, como cambios en políticas urbanas, movilidad sostenible o tendencias sociales.</w:t>
       </w:r>
     </w:p>
     <w:sectPr>

</xml_diff>